<commit_message>
actualización de metodologia documento fase 1 tradicional
</commit_message>
<xml_diff>
--- a/Fase 1/Evidencias Grupales/1.4_Desarrollo_informe_de_definicion_del_proyecto_APT.docx
+++ b/Fase 1/Evidencias Grupales/1.4_Desarrollo_informe_de_definicion_del_proyecto_APT.docx
@@ -4,6 +4,7 @@
   <w:body>
     <w:p>
       <w:pPr>
+        <w:ind w:left="720" w:hanging="720"/>
         <w:jc w:val="center"/>
       </w:pPr>
       <w:r>
@@ -108,20 +109,20 @@
     </w:p>
     <w:sdt>
       <w:sdtPr>
+        <w:rPr>
+          <w:rFonts w:asciiTheme="minorHAnsi" w:eastAsiaTheme="minorEastAsia" w:hAnsiTheme="minorHAnsi" w:cstheme="minorBidi"/>
+          <w:b w:val="0"/>
+          <w:bCs w:val="0"/>
+          <w:color w:val="auto"/>
+          <w:sz w:val="22"/>
+          <w:szCs w:val="22"/>
+        </w:rPr>
         <w:id w:val="156806518"/>
         <w:docPartObj>
           <w:docPartGallery w:val="Table of Contents"/>
           <w:docPartUnique/>
         </w:docPartObj>
       </w:sdtPr>
-      <w:sdtEndPr>
-        <w:rPr>
-          <w:rFonts w:asciiTheme="minorHAnsi" w:eastAsiaTheme="minorEastAsia" w:hAnsiTheme="minorHAnsi" w:cstheme="minorBidi"/>
-          <w:color w:val="auto"/>
-          <w:sz w:val="22"/>
-          <w:szCs w:val="22"/>
-        </w:rPr>
-      </w:sdtEndPr>
       <w:sdtContent>
         <w:p>
           <w:pPr>
@@ -137,6 +138,9 @@
             <w:tabs>
               <w:tab w:val="right" w:leader="dot" w:pos="8630"/>
             </w:tabs>
+            <w:rPr>
+              <w:noProof/>
+            </w:rPr>
           </w:pPr>
           <w:r>
             <w:fldChar w:fldCharType="begin"/>
@@ -151,46 +155,54 @@
             <w:r>
               <w:rPr>
                 <w:rStyle w:val="Hipervnculo"/>
+                <w:noProof/>
               </w:rPr>
               <w:t>Índice</w:t>
             </w:r>
             <w:r>
               <w:rPr>
+                <w:noProof/>
                 <w:webHidden/>
               </w:rPr>
               <w:tab/>
             </w:r>
             <w:r>
               <w:rPr>
+                <w:noProof/>
                 <w:webHidden/>
               </w:rPr>
               <w:fldChar w:fldCharType="begin"/>
             </w:r>
             <w:r>
               <w:rPr>
+                <w:noProof/>
                 <w:webHidden/>
               </w:rPr>
               <w:instrText xml:space="preserve"> PAGEREF _Toc207054907 \h </w:instrText>
             </w:r>
             <w:r>
               <w:rPr>
+                <w:noProof/>
                 <w:webHidden/>
               </w:rPr>
             </w:r>
             <w:r>
               <w:rPr>
+                <w:noProof/>
                 <w:webHidden/>
               </w:rPr>
               <w:fldChar w:fldCharType="separate"/>
             </w:r>
             <w:r>
               <w:rPr>
+                <w:noProof/>
                 <w:webHidden/>
               </w:rPr>
               <w:t>2</w:t>
             </w:r>
             <w:r>
               <w:rPr>
+                <w:noProof/>
                 <w:webHidden/>
               </w:rPr>
               <w:fldChar w:fldCharType="end"/>
@@ -203,51 +215,62 @@
             <w:tabs>
               <w:tab w:val="right" w:leader="dot" w:pos="8630"/>
             </w:tabs>
+            <w:rPr>
+              <w:noProof/>
+            </w:rPr>
           </w:pPr>
           <w:hyperlink w:anchor="_Toc207054908" w:history="1">
             <w:r>
               <w:rPr>
                 <w:rStyle w:val="Hipervnculo"/>
+                <w:noProof/>
               </w:rPr>
               <w:t>Antecedentes personales</w:t>
             </w:r>
             <w:r>
               <w:rPr>
+                <w:noProof/>
                 <w:webHidden/>
               </w:rPr>
               <w:tab/>
             </w:r>
             <w:r>
               <w:rPr>
+                <w:noProof/>
                 <w:webHidden/>
               </w:rPr>
               <w:fldChar w:fldCharType="begin"/>
             </w:r>
             <w:r>
               <w:rPr>
+                <w:noProof/>
                 <w:webHidden/>
               </w:rPr>
               <w:instrText xml:space="preserve"> PAGEREF _Toc207054908 \h </w:instrText>
             </w:r>
             <w:r>
               <w:rPr>
+                <w:noProof/>
                 <w:webHidden/>
               </w:rPr>
             </w:r>
             <w:r>
               <w:rPr>
+                <w:noProof/>
                 <w:webHidden/>
               </w:rPr>
               <w:fldChar w:fldCharType="separate"/>
             </w:r>
             <w:r>
               <w:rPr>
+                <w:noProof/>
                 <w:webHidden/>
               </w:rPr>
               <w:t>3</w:t>
             </w:r>
             <w:r>
               <w:rPr>
+                <w:noProof/>
                 <w:webHidden/>
               </w:rPr>
               <w:fldChar w:fldCharType="end"/>
@@ -260,51 +283,62 @@
             <w:tabs>
               <w:tab w:val="right" w:leader="dot" w:pos="8630"/>
             </w:tabs>
+            <w:rPr>
+              <w:noProof/>
+            </w:rPr>
           </w:pPr>
           <w:hyperlink w:anchor="_Toc207054909" w:history="1">
             <w:r>
               <w:rPr>
                 <w:rStyle w:val="Hipervnculo"/>
+                <w:noProof/>
               </w:rPr>
               <w:t>Abstract (ES)</w:t>
             </w:r>
             <w:r>
               <w:rPr>
+                <w:noProof/>
                 <w:webHidden/>
               </w:rPr>
               <w:tab/>
             </w:r>
             <w:r>
               <w:rPr>
+                <w:noProof/>
                 <w:webHidden/>
               </w:rPr>
               <w:fldChar w:fldCharType="begin"/>
             </w:r>
             <w:r>
               <w:rPr>
+                <w:noProof/>
                 <w:webHidden/>
               </w:rPr>
               <w:instrText xml:space="preserve"> PAGEREF _Toc207054909 \h </w:instrText>
             </w:r>
             <w:r>
               <w:rPr>
+                <w:noProof/>
                 <w:webHidden/>
               </w:rPr>
             </w:r>
             <w:r>
               <w:rPr>
+                <w:noProof/>
                 <w:webHidden/>
               </w:rPr>
               <w:fldChar w:fldCharType="separate"/>
             </w:r>
             <w:r>
               <w:rPr>
+                <w:noProof/>
                 <w:webHidden/>
               </w:rPr>
               <w:t>3</w:t>
             </w:r>
             <w:r>
               <w:rPr>
+                <w:noProof/>
                 <w:webHidden/>
               </w:rPr>
               <w:fldChar w:fldCharType="end"/>
@@ -317,51 +351,62 @@
             <w:tabs>
               <w:tab w:val="right" w:leader="dot" w:pos="8630"/>
             </w:tabs>
+            <w:rPr>
+              <w:noProof/>
+            </w:rPr>
           </w:pPr>
           <w:hyperlink w:anchor="_Toc207054910" w:history="1">
             <w:r>
               <w:rPr>
                 <w:rStyle w:val="Hipervnculo"/>
+                <w:noProof/>
               </w:rPr>
               <w:t>Abstract (EN)</w:t>
             </w:r>
             <w:r>
               <w:rPr>
+                <w:noProof/>
                 <w:webHidden/>
               </w:rPr>
               <w:tab/>
             </w:r>
             <w:r>
               <w:rPr>
+                <w:noProof/>
                 <w:webHidden/>
               </w:rPr>
               <w:fldChar w:fldCharType="begin"/>
             </w:r>
             <w:r>
               <w:rPr>
+                <w:noProof/>
                 <w:webHidden/>
               </w:rPr>
               <w:instrText xml:space="preserve"> PAGEREF _Toc207054910 \h </w:instrText>
             </w:r>
             <w:r>
               <w:rPr>
+                <w:noProof/>
                 <w:webHidden/>
               </w:rPr>
             </w:r>
             <w:r>
               <w:rPr>
+                <w:noProof/>
                 <w:webHidden/>
               </w:rPr>
               <w:fldChar w:fldCharType="separate"/>
             </w:r>
             <w:r>
               <w:rPr>
+                <w:noProof/>
                 <w:webHidden/>
               </w:rPr>
               <w:t>3</w:t>
             </w:r>
             <w:r>
               <w:rPr>
+                <w:noProof/>
                 <w:webHidden/>
               </w:rPr>
               <w:fldChar w:fldCharType="end"/>
@@ -374,51 +419,62 @@
             <w:tabs>
               <w:tab w:val="right" w:leader="dot" w:pos="8630"/>
             </w:tabs>
+            <w:rPr>
+              <w:noProof/>
+            </w:rPr>
           </w:pPr>
           <w:hyperlink w:anchor="_Toc207054911" w:history="1">
             <w:r>
               <w:rPr>
                 <w:rStyle w:val="Hipervnculo"/>
+                <w:noProof/>
               </w:rPr>
               <w:t>1. Descripción y relevancia</w:t>
             </w:r>
             <w:r>
               <w:rPr>
+                <w:noProof/>
                 <w:webHidden/>
               </w:rPr>
               <w:tab/>
             </w:r>
             <w:r>
               <w:rPr>
+                <w:noProof/>
                 <w:webHidden/>
               </w:rPr>
               <w:fldChar w:fldCharType="begin"/>
             </w:r>
             <w:r>
               <w:rPr>
+                <w:noProof/>
                 <w:webHidden/>
               </w:rPr>
               <w:instrText xml:space="preserve"> PAGEREF _Toc207054911 \h </w:instrText>
             </w:r>
             <w:r>
               <w:rPr>
+                <w:noProof/>
                 <w:webHidden/>
               </w:rPr>
             </w:r>
             <w:r>
               <w:rPr>
+                <w:noProof/>
                 <w:webHidden/>
               </w:rPr>
               <w:fldChar w:fldCharType="separate"/>
             </w:r>
             <w:r>
               <w:rPr>
+                <w:noProof/>
                 <w:webHidden/>
               </w:rPr>
               <w:t>3</w:t>
             </w:r>
             <w:r>
               <w:rPr>
+                <w:noProof/>
                 <w:webHidden/>
               </w:rPr>
               <w:fldChar w:fldCharType="end"/>
@@ -431,51 +487,62 @@
             <w:tabs>
               <w:tab w:val="right" w:leader="dot" w:pos="8630"/>
             </w:tabs>
+            <w:rPr>
+              <w:noProof/>
+            </w:rPr>
           </w:pPr>
           <w:hyperlink w:anchor="_Toc207054912" w:history="1">
             <w:r>
               <w:rPr>
                 <w:rStyle w:val="Hipervnculo"/>
+                <w:noProof/>
               </w:rPr>
               <w:t>2. Competencias del perfil que se aplican</w:t>
             </w:r>
             <w:r>
               <w:rPr>
+                <w:noProof/>
                 <w:webHidden/>
               </w:rPr>
               <w:tab/>
             </w:r>
             <w:r>
               <w:rPr>
+                <w:noProof/>
                 <w:webHidden/>
               </w:rPr>
               <w:fldChar w:fldCharType="begin"/>
             </w:r>
             <w:r>
               <w:rPr>
+                <w:noProof/>
                 <w:webHidden/>
               </w:rPr>
               <w:instrText xml:space="preserve"> PAGEREF _Toc207054912 \h </w:instrText>
             </w:r>
             <w:r>
               <w:rPr>
+                <w:noProof/>
                 <w:webHidden/>
               </w:rPr>
             </w:r>
             <w:r>
               <w:rPr>
+                <w:noProof/>
                 <w:webHidden/>
               </w:rPr>
               <w:fldChar w:fldCharType="separate"/>
             </w:r>
             <w:r>
               <w:rPr>
+                <w:noProof/>
                 <w:webHidden/>
               </w:rPr>
               <w:t>3</w:t>
             </w:r>
             <w:r>
               <w:rPr>
+                <w:noProof/>
                 <w:webHidden/>
               </w:rPr>
               <w:fldChar w:fldCharType="end"/>
@@ -488,51 +555,62 @@
             <w:tabs>
               <w:tab w:val="right" w:leader="dot" w:pos="8630"/>
             </w:tabs>
+            <w:rPr>
+              <w:noProof/>
+            </w:rPr>
           </w:pPr>
           <w:hyperlink w:anchor="_Toc207054913" w:history="1">
             <w:r>
               <w:rPr>
                 <w:rStyle w:val="Hipervnculo"/>
+                <w:noProof/>
               </w:rPr>
               <w:t>3. Relación con los intereses profesionales</w:t>
             </w:r>
             <w:r>
               <w:rPr>
+                <w:noProof/>
                 <w:webHidden/>
               </w:rPr>
               <w:tab/>
             </w:r>
             <w:r>
               <w:rPr>
+                <w:noProof/>
                 <w:webHidden/>
               </w:rPr>
               <w:fldChar w:fldCharType="begin"/>
             </w:r>
             <w:r>
               <w:rPr>
+                <w:noProof/>
                 <w:webHidden/>
               </w:rPr>
               <w:instrText xml:space="preserve"> PAGEREF _Toc207054913 \h </w:instrText>
             </w:r>
             <w:r>
               <w:rPr>
+                <w:noProof/>
                 <w:webHidden/>
               </w:rPr>
             </w:r>
             <w:r>
               <w:rPr>
+                <w:noProof/>
                 <w:webHidden/>
               </w:rPr>
               <w:fldChar w:fldCharType="separate"/>
             </w:r>
             <w:r>
               <w:rPr>
+                <w:noProof/>
                 <w:webHidden/>
               </w:rPr>
               <w:t>4</w:t>
             </w:r>
             <w:r>
               <w:rPr>
+                <w:noProof/>
                 <w:webHidden/>
               </w:rPr>
               <w:fldChar w:fldCharType="end"/>
@@ -545,51 +623,62 @@
             <w:tabs>
               <w:tab w:val="right" w:leader="dot" w:pos="8630"/>
             </w:tabs>
+            <w:rPr>
+              <w:noProof/>
+            </w:rPr>
           </w:pPr>
           <w:hyperlink w:anchor="_Toc207054914" w:history="1">
             <w:r>
               <w:rPr>
                 <w:rStyle w:val="Hipervnculo"/>
+                <w:noProof/>
               </w:rPr>
               <w:t>4. Factibilidad (alcance, recursos, riesgos)</w:t>
             </w:r>
             <w:r>
               <w:rPr>
+                <w:noProof/>
                 <w:webHidden/>
               </w:rPr>
               <w:tab/>
             </w:r>
             <w:r>
               <w:rPr>
+                <w:noProof/>
                 <w:webHidden/>
               </w:rPr>
               <w:fldChar w:fldCharType="begin"/>
             </w:r>
             <w:r>
               <w:rPr>
+                <w:noProof/>
                 <w:webHidden/>
               </w:rPr>
               <w:instrText xml:space="preserve"> PAGEREF _Toc207054914 \h </w:instrText>
             </w:r>
             <w:r>
               <w:rPr>
+                <w:noProof/>
                 <w:webHidden/>
               </w:rPr>
             </w:r>
             <w:r>
               <w:rPr>
+                <w:noProof/>
                 <w:webHidden/>
               </w:rPr>
               <w:fldChar w:fldCharType="separate"/>
             </w:r>
             <w:r>
               <w:rPr>
+                <w:noProof/>
                 <w:webHidden/>
               </w:rPr>
               <w:t>4</w:t>
             </w:r>
             <w:r>
               <w:rPr>
+                <w:noProof/>
                 <w:webHidden/>
               </w:rPr>
               <w:fldChar w:fldCharType="end"/>
@@ -602,51 +691,62 @@
             <w:tabs>
               <w:tab w:val="right" w:leader="dot" w:pos="8630"/>
             </w:tabs>
+            <w:rPr>
+              <w:noProof/>
+            </w:rPr>
           </w:pPr>
           <w:hyperlink w:anchor="_Toc207054915" w:history="1">
             <w:r>
               <w:rPr>
                 <w:rStyle w:val="Hipervnculo"/>
+                <w:noProof/>
               </w:rPr>
               <w:t>5. Objetivo general y objetivos específicos</w:t>
             </w:r>
             <w:r>
               <w:rPr>
+                <w:noProof/>
                 <w:webHidden/>
               </w:rPr>
               <w:tab/>
             </w:r>
             <w:r>
               <w:rPr>
+                <w:noProof/>
                 <w:webHidden/>
               </w:rPr>
               <w:fldChar w:fldCharType="begin"/>
             </w:r>
             <w:r>
               <w:rPr>
+                <w:noProof/>
                 <w:webHidden/>
               </w:rPr>
               <w:instrText xml:space="preserve"> PAGEREF _Toc207054915 \h </w:instrText>
             </w:r>
             <w:r>
               <w:rPr>
+                <w:noProof/>
                 <w:webHidden/>
               </w:rPr>
             </w:r>
             <w:r>
               <w:rPr>
+                <w:noProof/>
                 <w:webHidden/>
               </w:rPr>
               <w:fldChar w:fldCharType="separate"/>
             </w:r>
             <w:r>
               <w:rPr>
+                <w:noProof/>
                 <w:webHidden/>
               </w:rPr>
               <w:t>4</w:t>
             </w:r>
             <w:r>
               <w:rPr>
+                <w:noProof/>
                 <w:webHidden/>
               </w:rPr>
               <w:fldChar w:fldCharType="end"/>
@@ -659,51 +759,62 @@
             <w:tabs>
               <w:tab w:val="right" w:leader="dot" w:pos="8630"/>
             </w:tabs>
+            <w:rPr>
+              <w:noProof/>
+            </w:rPr>
           </w:pPr>
           <w:hyperlink w:anchor="_Toc207054916" w:history="1">
             <w:r>
               <w:rPr>
                 <w:rStyle w:val="Hipervnculo"/>
+                <w:noProof/>
               </w:rPr>
               <w:t>6. Metodología</w:t>
             </w:r>
             <w:r>
               <w:rPr>
+                <w:noProof/>
                 <w:webHidden/>
               </w:rPr>
               <w:tab/>
             </w:r>
             <w:r>
               <w:rPr>
+                <w:noProof/>
                 <w:webHidden/>
               </w:rPr>
               <w:fldChar w:fldCharType="begin"/>
             </w:r>
             <w:r>
               <w:rPr>
+                <w:noProof/>
                 <w:webHidden/>
               </w:rPr>
               <w:instrText xml:space="preserve"> PAGEREF _Toc207054916 \h </w:instrText>
             </w:r>
             <w:r>
               <w:rPr>
+                <w:noProof/>
                 <w:webHidden/>
               </w:rPr>
             </w:r>
             <w:r>
               <w:rPr>
+                <w:noProof/>
                 <w:webHidden/>
               </w:rPr>
               <w:fldChar w:fldCharType="separate"/>
             </w:r>
             <w:r>
               <w:rPr>
+                <w:noProof/>
                 <w:webHidden/>
               </w:rPr>
               <w:t>4</w:t>
             </w:r>
             <w:r>
               <w:rPr>
+                <w:noProof/>
                 <w:webHidden/>
               </w:rPr>
               <w:fldChar w:fldCharType="end"/>
@@ -716,51 +827,62 @@
             <w:tabs>
               <w:tab w:val="right" w:leader="dot" w:pos="8630"/>
             </w:tabs>
+            <w:rPr>
+              <w:noProof/>
+            </w:rPr>
           </w:pPr>
           <w:hyperlink w:anchor="_Toc207054917" w:history="1">
             <w:r>
               <w:rPr>
                 <w:rStyle w:val="Hipervnculo"/>
+                <w:noProof/>
               </w:rPr>
               <w:t>7. Plan de trabajo + evidencias</w:t>
             </w:r>
             <w:r>
               <w:rPr>
+                <w:noProof/>
                 <w:webHidden/>
               </w:rPr>
               <w:tab/>
             </w:r>
             <w:r>
               <w:rPr>
+                <w:noProof/>
                 <w:webHidden/>
               </w:rPr>
               <w:fldChar w:fldCharType="begin"/>
             </w:r>
             <w:r>
               <w:rPr>
+                <w:noProof/>
                 <w:webHidden/>
               </w:rPr>
               <w:instrText xml:space="preserve"> PAGEREF _Toc207054917 \h </w:instrText>
             </w:r>
             <w:r>
               <w:rPr>
+                <w:noProof/>
                 <w:webHidden/>
               </w:rPr>
             </w:r>
             <w:r>
               <w:rPr>
+                <w:noProof/>
                 <w:webHidden/>
               </w:rPr>
               <w:fldChar w:fldCharType="separate"/>
             </w:r>
             <w:r>
               <w:rPr>
+                <w:noProof/>
                 <w:webHidden/>
               </w:rPr>
-              <w:t>4</w:t>
-            </w:r>
-            <w:r>
-              <w:rPr>
+              <w:t>5</w:t>
+            </w:r>
+            <w:r>
+              <w:rPr>
+                <w:noProof/>
                 <w:webHidden/>
               </w:rPr>
               <w:fldChar w:fldCharType="end"/>
@@ -773,51 +895,62 @@
             <w:tabs>
               <w:tab w:val="right" w:leader="dot" w:pos="8630"/>
             </w:tabs>
+            <w:rPr>
+              <w:noProof/>
+            </w:rPr>
           </w:pPr>
           <w:hyperlink w:anchor="_Toc207054918" w:history="1">
             <w:r>
               <w:rPr>
                 <w:rStyle w:val="Hipervnculo"/>
+                <w:noProof/>
               </w:rPr>
               <w:t>Evidencias</w:t>
             </w:r>
             <w:r>
               <w:rPr>
+                <w:noProof/>
                 <w:webHidden/>
               </w:rPr>
               <w:tab/>
             </w:r>
             <w:r>
               <w:rPr>
+                <w:noProof/>
                 <w:webHidden/>
               </w:rPr>
               <w:fldChar w:fldCharType="begin"/>
             </w:r>
             <w:r>
               <w:rPr>
+                <w:noProof/>
                 <w:webHidden/>
               </w:rPr>
               <w:instrText xml:space="preserve"> PAGEREF _Toc207054918 \h </w:instrText>
             </w:r>
             <w:r>
               <w:rPr>
+                <w:noProof/>
                 <w:webHidden/>
               </w:rPr>
             </w:r>
             <w:r>
               <w:rPr>
+                <w:noProof/>
                 <w:webHidden/>
               </w:rPr>
               <w:fldChar w:fldCharType="separate"/>
             </w:r>
             <w:r>
               <w:rPr>
+                <w:noProof/>
                 <w:webHidden/>
               </w:rPr>
               <w:t>7</w:t>
             </w:r>
             <w:r>
               <w:rPr>
+                <w:noProof/>
                 <w:webHidden/>
               </w:rPr>
               <w:fldChar w:fldCharType="end"/>
@@ -830,51 +963,62 @@
             <w:tabs>
               <w:tab w:val="right" w:leader="dot" w:pos="8630"/>
             </w:tabs>
+            <w:rPr>
+              <w:noProof/>
+            </w:rPr>
           </w:pPr>
           <w:hyperlink w:anchor="_Toc207054919" w:history="1">
             <w:r>
               <w:rPr>
                 <w:rStyle w:val="Hipervnculo"/>
+                <w:noProof/>
               </w:rPr>
               <w:t>8. Indicadores de calidad (IL 1.5) – checklist del equipo</w:t>
             </w:r>
             <w:r>
               <w:rPr>
+                <w:noProof/>
                 <w:webHidden/>
               </w:rPr>
               <w:tab/>
             </w:r>
             <w:r>
               <w:rPr>
+                <w:noProof/>
                 <w:webHidden/>
               </w:rPr>
               <w:fldChar w:fldCharType="begin"/>
             </w:r>
             <w:r>
               <w:rPr>
+                <w:noProof/>
                 <w:webHidden/>
               </w:rPr>
               <w:instrText xml:space="preserve"> PAGEREF _Toc207054919 \h </w:instrText>
             </w:r>
             <w:r>
               <w:rPr>
+                <w:noProof/>
                 <w:webHidden/>
               </w:rPr>
             </w:r>
             <w:r>
               <w:rPr>
+                <w:noProof/>
                 <w:webHidden/>
               </w:rPr>
               <w:fldChar w:fldCharType="separate"/>
             </w:r>
             <w:r>
               <w:rPr>
+                <w:noProof/>
                 <w:webHidden/>
               </w:rPr>
               <w:t>7</w:t>
             </w:r>
             <w:r>
               <w:rPr>
+                <w:noProof/>
                 <w:webHidden/>
               </w:rPr>
               <w:fldChar w:fldCharType="end"/>
@@ -887,51 +1031,62 @@
             <w:tabs>
               <w:tab w:val="right" w:leader="dot" w:pos="8630"/>
             </w:tabs>
+            <w:rPr>
+              <w:noProof/>
+            </w:rPr>
           </w:pPr>
           <w:hyperlink w:anchor="_Toc207054920" w:history="1">
             <w:r>
               <w:rPr>
                 <w:rStyle w:val="Hipervnculo"/>
+                <w:noProof/>
               </w:rPr>
               <w:t>9. Conclusiones individuales (EN)</w:t>
             </w:r>
             <w:r>
               <w:rPr>
+                <w:noProof/>
                 <w:webHidden/>
               </w:rPr>
               <w:tab/>
             </w:r>
             <w:r>
               <w:rPr>
+                <w:noProof/>
                 <w:webHidden/>
               </w:rPr>
               <w:fldChar w:fldCharType="begin"/>
             </w:r>
             <w:r>
               <w:rPr>
+                <w:noProof/>
                 <w:webHidden/>
               </w:rPr>
               <w:instrText xml:space="preserve"> PAGEREF _Toc207054920 \h </w:instrText>
             </w:r>
             <w:r>
               <w:rPr>
+                <w:noProof/>
                 <w:webHidden/>
               </w:rPr>
             </w:r>
             <w:r>
               <w:rPr>
+                <w:noProof/>
                 <w:webHidden/>
               </w:rPr>
               <w:fldChar w:fldCharType="separate"/>
             </w:r>
             <w:r>
               <w:rPr>
+                <w:noProof/>
                 <w:webHidden/>
               </w:rPr>
               <w:t>8</w:t>
             </w:r>
             <w:r>
               <w:rPr>
+                <w:noProof/>
                 <w:webHidden/>
               </w:rPr>
               <w:fldChar w:fldCharType="end"/>
@@ -944,51 +1099,62 @@
             <w:tabs>
               <w:tab w:val="right" w:leader="dot" w:pos="8630"/>
             </w:tabs>
+            <w:rPr>
+              <w:noProof/>
+            </w:rPr>
           </w:pPr>
           <w:hyperlink w:anchor="_Toc207054921" w:history="1">
             <w:r>
               <w:rPr>
                 <w:rStyle w:val="Hipervnculo"/>
+                <w:noProof/>
               </w:rPr>
               <w:t>10. Reflexión individual (EN)</w:t>
             </w:r>
             <w:r>
               <w:rPr>
+                <w:noProof/>
                 <w:webHidden/>
               </w:rPr>
               <w:tab/>
             </w:r>
             <w:r>
               <w:rPr>
+                <w:noProof/>
                 <w:webHidden/>
               </w:rPr>
               <w:fldChar w:fldCharType="begin"/>
             </w:r>
             <w:r>
               <w:rPr>
+                <w:noProof/>
                 <w:webHidden/>
               </w:rPr>
               <w:instrText xml:space="preserve"> PAGEREF _Toc207054921 \h </w:instrText>
             </w:r>
             <w:r>
               <w:rPr>
+                <w:noProof/>
                 <w:webHidden/>
               </w:rPr>
             </w:r>
             <w:r>
               <w:rPr>
+                <w:noProof/>
                 <w:webHidden/>
               </w:rPr>
               <w:fldChar w:fldCharType="separate"/>
             </w:r>
             <w:r>
               <w:rPr>
+                <w:noProof/>
                 <w:webHidden/>
               </w:rPr>
               <w:t>8</w:t>
             </w:r>
             <w:r>
               <w:rPr>
+                <w:noProof/>
                 <w:webHidden/>
               </w:rPr>
               <w:fldChar w:fldCharType="end"/>
@@ -1001,51 +1167,62 @@
             <w:tabs>
               <w:tab w:val="right" w:leader="dot" w:pos="8630"/>
             </w:tabs>
+            <w:rPr>
+              <w:noProof/>
+            </w:rPr>
           </w:pPr>
           <w:hyperlink w:anchor="_Toc207054922" w:history="1">
             <w:r>
               <w:rPr>
                 <w:rStyle w:val="Hipervnculo"/>
+                <w:noProof/>
               </w:rPr>
               <w:t>Referencias</w:t>
             </w:r>
             <w:r>
               <w:rPr>
+                <w:noProof/>
                 <w:webHidden/>
               </w:rPr>
               <w:tab/>
             </w:r>
             <w:r>
               <w:rPr>
+                <w:noProof/>
                 <w:webHidden/>
               </w:rPr>
               <w:fldChar w:fldCharType="begin"/>
             </w:r>
             <w:r>
               <w:rPr>
+                <w:noProof/>
                 <w:webHidden/>
               </w:rPr>
               <w:instrText xml:space="preserve"> PAGEREF _Toc207054922 \h </w:instrText>
             </w:r>
             <w:r>
               <w:rPr>
+                <w:noProof/>
                 <w:webHidden/>
               </w:rPr>
             </w:r>
             <w:r>
               <w:rPr>
+                <w:noProof/>
                 <w:webHidden/>
               </w:rPr>
               <w:fldChar w:fldCharType="separate"/>
             </w:r>
             <w:r>
               <w:rPr>
+                <w:noProof/>
                 <w:webHidden/>
               </w:rPr>
-              <w:t>9</w:t>
-            </w:r>
-            <w:r>
-              <w:rPr>
+              <w:t>8</w:t>
+            </w:r>
+            <w:r>
+              <w:rPr>
+                <w:noProof/>
                 <w:webHidden/>
               </w:rPr>
               <w:fldChar w:fldCharType="end"/>
@@ -1058,51 +1235,62 @@
             <w:tabs>
               <w:tab w:val="right" w:leader="dot" w:pos="8630"/>
             </w:tabs>
+            <w:rPr>
+              <w:noProof/>
+            </w:rPr>
           </w:pPr>
           <w:hyperlink w:anchor="_Toc207054923" w:history="1">
             <w:r>
               <w:rPr>
                 <w:rStyle w:val="Hipervnculo"/>
+                <w:noProof/>
               </w:rPr>
               <w:t>Anexos</w:t>
             </w:r>
             <w:r>
               <w:rPr>
+                <w:noProof/>
                 <w:webHidden/>
               </w:rPr>
               <w:tab/>
             </w:r>
             <w:r>
               <w:rPr>
+                <w:noProof/>
                 <w:webHidden/>
               </w:rPr>
               <w:fldChar w:fldCharType="begin"/>
             </w:r>
             <w:r>
               <w:rPr>
+                <w:noProof/>
                 <w:webHidden/>
               </w:rPr>
               <w:instrText xml:space="preserve"> PAGEREF _Toc207054923 \h </w:instrText>
             </w:r>
             <w:r>
               <w:rPr>
+                <w:noProof/>
                 <w:webHidden/>
               </w:rPr>
             </w:r>
             <w:r>
               <w:rPr>
+                <w:noProof/>
                 <w:webHidden/>
               </w:rPr>
               <w:fldChar w:fldCharType="separate"/>
             </w:r>
             <w:r>
               <w:rPr>
+                <w:noProof/>
                 <w:webHidden/>
               </w:rPr>
               <w:t>9</w:t>
             </w:r>
             <w:r>
               <w:rPr>
+                <w:noProof/>
                 <w:webHidden/>
               </w:rPr>
               <w:fldChar w:fldCharType="end"/>
@@ -1554,59 +1742,378 @@
       </w:r>
       <w:bookmarkEnd w:id="9"/>
     </w:p>
+    <w:p/>
     <w:p>
+      <w:pPr>
+        <w:rPr>
+          <w:lang w:val="es-CL"/>
+        </w:rPr>
+      </w:pPr>
       <w:r>
-        <w:t xml:space="preserve">Scrum light con </w:t>
+        <w:rPr>
+          <w:lang w:val="es-CL"/>
+        </w:rPr>
+        <w:t xml:space="preserve">El proyecto se desarrollará bajo una </w:t>
+      </w:r>
+      <w:r>
+        <w:rPr>
+          <w:b/>
+          <w:bCs/>
+          <w:lang w:val="es-CL"/>
+        </w:rPr>
+        <w:t>metodología tradicional por hitos</w:t>
+      </w:r>
+      <w:r>
+        <w:rPr>
+          <w:lang w:val="es-CL"/>
+        </w:rPr>
+        <w:t>, donde las actividades se organizan en fases secuenciales y cada etapa culmina con la entrega de productos concretos. Este enfoque permite mantener un control más claro del avance, cumplir con las entregas definidas en el programa académico y asegurar que el proyecto se construya de manera progresiva y acumulativa.</w:t>
+      </w:r>
+    </w:p>
+    <w:p>
+      <w:pPr>
+        <w:rPr>
+          <w:lang w:val="es-CL"/>
+        </w:rPr>
+      </w:pPr>
+      <w:r>
+        <w:rPr>
+          <w:lang w:val="es-CL"/>
+        </w:rPr>
+        <w:t>Las etapas e hitos definidos son:</w:t>
+      </w:r>
+    </w:p>
+    <w:p>
+      <w:pPr>
+        <w:numPr>
+          <w:ilvl w:val="0"/>
+          <w:numId w:val="10"/>
+        </w:numPr>
+        <w:rPr>
+          <w:lang w:val="es-CL"/>
+        </w:rPr>
+      </w:pPr>
+      <w:r>
+        <w:rPr>
+          <w:b/>
+          <w:bCs/>
+          <w:lang w:val="es-CL"/>
+        </w:rPr>
+        <w:t>Definición y planificación del proyecto</w:t>
+      </w:r>
+    </w:p>
+    <w:p>
+      <w:pPr>
+        <w:numPr>
+          <w:ilvl w:val="1"/>
+          <w:numId w:val="10"/>
+        </w:numPr>
+        <w:rPr>
+          <w:lang w:val="es-CL"/>
+        </w:rPr>
+      </w:pPr>
+      <w:r>
+        <w:rPr>
+          <w:lang w:val="es-CL"/>
+        </w:rPr>
+        <w:lastRenderedPageBreak/>
+        <w:t>Elaboración del acta de constitución, definición de objetivos, alcance, requerimientos y análisis de factibilidad.</w:t>
+      </w:r>
+    </w:p>
+    <w:p>
+      <w:pPr>
+        <w:numPr>
+          <w:ilvl w:val="1"/>
+          <w:numId w:val="10"/>
+        </w:numPr>
+        <w:rPr>
+          <w:lang w:val="es-CL"/>
+        </w:rPr>
+      </w:pPr>
+      <w:r>
+        <w:rPr>
+          <w:lang w:val="es-CL"/>
+        </w:rPr>
+        <w:t>Entregable: Documento de definición del proyecto + diseño inicial de la arquitectura y modelo de datos.</w:t>
+      </w:r>
+    </w:p>
+    <w:p>
+      <w:pPr>
+        <w:numPr>
+          <w:ilvl w:val="0"/>
+          <w:numId w:val="10"/>
+        </w:numPr>
+        <w:rPr>
+          <w:lang w:val="es-CL"/>
+        </w:rPr>
+      </w:pPr>
+      <w:r>
+        <w:rPr>
+          <w:b/>
+          <w:bCs/>
+          <w:lang w:val="es-CL"/>
+        </w:rPr>
+        <w:t>Diseño y desarrollo parcial</w:t>
+      </w:r>
+    </w:p>
+    <w:p>
+      <w:pPr>
+        <w:numPr>
+          <w:ilvl w:val="1"/>
+          <w:numId w:val="10"/>
+        </w:numPr>
+        <w:rPr>
+          <w:lang w:val="es-CL"/>
+        </w:rPr>
+      </w:pPr>
+      <w:r>
+        <w:rPr>
+          <w:lang w:val="es-CL"/>
+        </w:rPr>
+        <w:t xml:space="preserve">Implementación inicial de </w:t>
       </w:r>
       <w:proofErr w:type="spellStart"/>
       <w:r>
-        <w:t>sprints</w:t>
+        <w:rPr>
+          <w:lang w:val="es-CL"/>
+        </w:rPr>
+        <w:t>backend</w:t>
       </w:r>
       <w:proofErr w:type="spellEnd"/>
       <w:r>
-        <w:t xml:space="preserve"> de 2 semanas, </w:t>
+        <w:rPr>
+          <w:lang w:val="es-CL"/>
+        </w:rPr>
+        <w:t xml:space="preserve"> (autenticación, agenda de citas) y </w:t>
       </w:r>
       <w:proofErr w:type="spellStart"/>
       <w:r>
-        <w:t>issues</w:t>
+        <w:rPr>
+          <w:lang w:val="es-CL"/>
+        </w:rPr>
+        <w:t>frontend</w:t>
       </w:r>
       <w:proofErr w:type="spellEnd"/>
       <w:r>
-        <w:t>/</w:t>
+        <w:rPr>
+          <w:lang w:val="es-CL"/>
+        </w:rPr>
+        <w:t xml:space="preserve"> básico (</w:t>
       </w:r>
       <w:proofErr w:type="spellStart"/>
       <w:r>
-        <w:t>boards</w:t>
+        <w:rPr>
+          <w:lang w:val="es-CL"/>
+        </w:rPr>
+        <w:t>login</w:t>
       </w:r>
       <w:proofErr w:type="spellEnd"/>
       <w:r>
-        <w:t xml:space="preserve"> en GitHub, definición de listo (</w:t>
+        <w:rPr>
+          <w:lang w:val="es-CL"/>
+        </w:rPr>
+        <w:t>, agendamiento).</w:t>
+      </w:r>
+    </w:p>
+    <w:p>
+      <w:pPr>
+        <w:numPr>
+          <w:ilvl w:val="1"/>
+          <w:numId w:val="10"/>
+        </w:numPr>
+        <w:rPr>
+          <w:lang w:val="es-CL"/>
+        </w:rPr>
+      </w:pPr>
+      <w:r>
+        <w:rPr>
+          <w:lang w:val="es-CL"/>
+        </w:rPr>
+        <w:t>Entregable: Prototipo funcional parcial que evidencia factibilidad técnica.</w:t>
+      </w:r>
+    </w:p>
+    <w:p>
+      <w:pPr>
+        <w:numPr>
+          <w:ilvl w:val="0"/>
+          <w:numId w:val="10"/>
+        </w:numPr>
+        <w:rPr>
+          <w:lang w:val="es-CL"/>
+        </w:rPr>
+      </w:pPr>
+      <w:r>
+        <w:rPr>
+          <w:b/>
+          <w:bCs/>
+          <w:lang w:val="es-CL"/>
+        </w:rPr>
+        <w:t>Desarrollo avanzado y pruebas</w:t>
+      </w:r>
+    </w:p>
+    <w:p>
+      <w:pPr>
+        <w:numPr>
+          <w:ilvl w:val="1"/>
+          <w:numId w:val="10"/>
+        </w:numPr>
+        <w:rPr>
+          <w:lang w:val="es-CL"/>
+        </w:rPr>
+      </w:pPr>
+      <w:r>
+        <w:rPr>
+          <w:lang w:val="es-CL"/>
+        </w:rPr>
+        <w:t>Integración del cuestionario de síntomas, motor de reglas, panel médico y reportes simples.</w:t>
+      </w:r>
+    </w:p>
+    <w:p>
+      <w:pPr>
+        <w:numPr>
+          <w:ilvl w:val="1"/>
+          <w:numId w:val="10"/>
+        </w:numPr>
+        <w:rPr>
+          <w:lang w:val="es-CL"/>
+        </w:rPr>
+      </w:pPr>
+      <w:r>
+        <w:rPr>
+          <w:lang w:val="es-CL"/>
+        </w:rPr>
+        <w:t>Ejecución de pruebas unitarias e integración.</w:t>
+      </w:r>
+    </w:p>
+    <w:p>
+      <w:pPr>
+        <w:numPr>
+          <w:ilvl w:val="1"/>
+          <w:numId w:val="10"/>
+        </w:numPr>
+        <w:rPr>
+          <w:lang w:val="es-CL"/>
+        </w:rPr>
+      </w:pPr>
+      <w:r>
+        <w:rPr>
+          <w:lang w:val="es-CL"/>
+        </w:rPr>
+        <w:t>Entregable: MVP completo (</w:t>
       </w:r>
       <w:proofErr w:type="spellStart"/>
       <w:r>
-        <w:t>DoD</w:t>
+        <w:rPr>
+          <w:lang w:val="es-CL"/>
+        </w:rPr>
+        <w:t>MediTriage</w:t>
       </w:r>
       <w:proofErr w:type="spellEnd"/>
       <w:r>
-        <w:t xml:space="preserve">) y demo corta por sprint. Trazabilidad con </w:t>
-      </w:r>
-      <w:proofErr w:type="spellStart"/>
-      <w:r>
-        <w:t>commits</w:t>
-      </w:r>
-      <w:proofErr w:type="spellEnd"/>
-      <w:r>
-        <w:t xml:space="preserve"> y </w:t>
-      </w:r>
-      <w:proofErr w:type="spellStart"/>
-      <w:r>
-        <w:t>PRs</w:t>
-      </w:r>
-      <w:proofErr w:type="spellEnd"/>
-      <w:r>
-        <w:t>.</w:t>
+        <w:rPr>
+          <w:lang w:val="es-CL"/>
+        </w:rPr>
+        <w:t>).</w:t>
       </w:r>
     </w:p>
+    <w:p>
+      <w:pPr>
+        <w:numPr>
+          <w:ilvl w:val="0"/>
+          <w:numId w:val="10"/>
+        </w:numPr>
+        <w:rPr>
+          <w:lang w:val="es-CL"/>
+        </w:rPr>
+      </w:pPr>
+      <w:r>
+        <w:rPr>
+          <w:b/>
+          <w:bCs/>
+          <w:lang w:val="es-CL"/>
+        </w:rPr>
+        <w:t>Cierre y defensa final</w:t>
+      </w:r>
+    </w:p>
+    <w:p>
+      <w:pPr>
+        <w:numPr>
+          <w:ilvl w:val="1"/>
+          <w:numId w:val="10"/>
+        </w:numPr>
+        <w:rPr>
+          <w:lang w:val="es-CL"/>
+        </w:rPr>
+      </w:pPr>
+      <w:r>
+        <w:rPr>
+          <w:lang w:val="es-CL"/>
+        </w:rPr>
+        <w:t>Documentación técnica y de usuario.</w:t>
+      </w:r>
+    </w:p>
+    <w:p>
+      <w:pPr>
+        <w:numPr>
+          <w:ilvl w:val="1"/>
+          <w:numId w:val="10"/>
+        </w:numPr>
+        <w:rPr>
+          <w:lang w:val="es-CL"/>
+        </w:rPr>
+      </w:pPr>
+      <w:r>
+        <w:rPr>
+          <w:lang w:val="es-CL"/>
+        </w:rPr>
+        <w:t>Preparación de presentación y demo para comisión evaluadora.</w:t>
+      </w:r>
+    </w:p>
+    <w:p>
+      <w:pPr>
+        <w:numPr>
+          <w:ilvl w:val="1"/>
+          <w:numId w:val="10"/>
+        </w:numPr>
+        <w:rPr>
+          <w:lang w:val="es-CL"/>
+        </w:rPr>
+      </w:pPr>
+      <w:r>
+        <w:rPr>
+          <w:lang w:val="es-CL"/>
+        </w:rPr>
+        <w:t>Entregable: Presentación final, video demo y documentación completa.</w:t>
+      </w:r>
+    </w:p>
+    <w:p>
+      <w:pPr>
+        <w:rPr>
+          <w:lang w:val="es-CL"/>
+        </w:rPr>
+      </w:pPr>
+      <w:r>
+        <w:rPr>
+          <w:lang w:val="es-CL"/>
+        </w:rPr>
+        <w:t xml:space="preserve">Con este enfoque secuencial, cada fase constituye un </w:t>
+      </w:r>
+      <w:r>
+        <w:rPr>
+          <w:b/>
+          <w:bCs/>
+          <w:lang w:val="es-CL"/>
+        </w:rPr>
+        <w:t>hito de avance validado</w:t>
+      </w:r>
+      <w:r>
+        <w:rPr>
+          <w:lang w:val="es-CL"/>
+        </w:rPr>
+        <w:t>, asegurando que el proyecto cumpla con los tiempos y estándares académicos de la asignatura.</w:t>
+      </w:r>
+    </w:p>
+    <w:p/>
     <w:p>
       <w:pPr>
         <w:pStyle w:val="Ttulo1"/>
@@ -1622,1372 +2129,1226 @@
         <w:t>Plan por semanas (S1–S15). Ajusta fechas reales según el cronograma de la sección.</w:t>
       </w:r>
     </w:p>
+    <w:p>
+      <w:r>
+        <w:br w:type="page"/>
+      </w:r>
+    </w:p>
     <w:tbl>
       <w:tblPr>
-        <w:tblW w:w="0" w:type="auto"/>
-        <w:jc w:val="center"/>
+        <w:tblW w:w="9300" w:type="dxa"/>
+        <w:tblInd w:w="75" w:type="dxa"/>
+        <w:tblCellMar>
+          <w:left w:w="70" w:type="dxa"/>
+          <w:right w:w="70" w:type="dxa"/>
+        </w:tblCellMar>
         <w:tblLook w:val="04A0" w:firstRow="1" w:lastRow="0" w:firstColumn="1" w:lastColumn="0" w:noHBand="0" w:noVBand="1"/>
       </w:tblPr>
       <w:tblGrid>
-        <w:gridCol w:w="952"/>
-        <w:gridCol w:w="2052"/>
-        <w:gridCol w:w="1091"/>
-        <w:gridCol w:w="1567"/>
-        <w:gridCol w:w="1881"/>
-        <w:gridCol w:w="1313"/>
+        <w:gridCol w:w="1240"/>
+        <w:gridCol w:w="2349"/>
+        <w:gridCol w:w="1558"/>
+        <w:gridCol w:w="1376"/>
+        <w:gridCol w:w="1512"/>
+        <w:gridCol w:w="1265"/>
       </w:tblGrid>
       <w:tr>
         <w:trPr>
-          <w:jc w:val="center"/>
+          <w:trHeight w:val="528"/>
         </w:trPr>
         <w:tc>
           <w:tcPr>
-            <w:tcW w:w="1440" w:type="dxa"/>
+            <w:tcW w:w="1250" w:type="dxa"/>
+            <w:tcBorders>
+              <w:top w:val="single" w:sz="4" w:space="0" w:color="156082"/>
+              <w:left w:val="single" w:sz="4" w:space="0" w:color="156082"/>
+              <w:bottom w:val="nil"/>
+              <w:right w:val="nil"/>
+            </w:tcBorders>
+            <w:shd w:val="clear" w:color="156082" w:fill="156082"/>
+            <w:vAlign w:val="center"/>
+            <w:hideMark/>
           </w:tcPr>
           <w:p>
-            <w:r>
-              <w:t>Semana(s)</w:t>
+            <w:pPr>
+              <w:spacing w:after="0" w:line="240" w:lineRule="auto"/>
+              <w:jc w:val="center"/>
+              <w:rPr>
+                <w:rFonts w:ascii="Aptos Narrow" w:eastAsia="Times New Roman" w:hAnsi="Aptos Narrow" w:cs="Times New Roman"/>
+                <w:b/>
+                <w:bCs/>
+                <w:color w:val="FFFFFF"/>
+                <w:lang w:val="es-CL" w:eastAsia="es-CL"/>
+              </w:rPr>
+            </w:pPr>
+            <w:r>
+              <w:rPr>
+                <w:rFonts w:ascii="Aptos Narrow" w:eastAsia="Times New Roman" w:hAnsi="Aptos Narrow" w:cs="Times New Roman"/>
+                <w:b/>
+                <w:bCs/>
+                <w:color w:val="FFFFFF"/>
+                <w:lang w:val="es-CL" w:eastAsia="es-CL"/>
+              </w:rPr>
+              <w:lastRenderedPageBreak/>
+              <w:t>Fase / Hito</w:t>
             </w:r>
           </w:p>
         </w:tc>
         <w:tc>
           <w:tcPr>
-            <w:tcW w:w="1440" w:type="dxa"/>
+            <w:tcW w:w="2403" w:type="dxa"/>
+            <w:tcBorders>
+              <w:top w:val="single" w:sz="4" w:space="0" w:color="156082"/>
+              <w:left w:val="nil"/>
+              <w:bottom w:val="nil"/>
+              <w:right w:val="nil"/>
+            </w:tcBorders>
+            <w:shd w:val="clear" w:color="156082" w:fill="156082"/>
+            <w:vAlign w:val="center"/>
+            <w:hideMark/>
           </w:tcPr>
           <w:p>
-            <w:r>
-              <w:t>Actividad</w:t>
+            <w:pPr>
+              <w:spacing w:after="0" w:line="240" w:lineRule="auto"/>
+              <w:jc w:val="center"/>
+              <w:rPr>
+                <w:rFonts w:ascii="Aptos Narrow" w:eastAsia="Times New Roman" w:hAnsi="Aptos Narrow" w:cs="Times New Roman"/>
+                <w:b/>
+                <w:bCs/>
+                <w:color w:val="FFFFFF"/>
+                <w:lang w:val="es-CL" w:eastAsia="es-CL"/>
+              </w:rPr>
+            </w:pPr>
+            <w:r>
+              <w:rPr>
+                <w:rFonts w:ascii="Aptos Narrow" w:eastAsia="Times New Roman" w:hAnsi="Aptos Narrow" w:cs="Times New Roman"/>
+                <w:b/>
+                <w:bCs/>
+                <w:color w:val="FFFFFF"/>
+                <w:lang w:val="es-CL" w:eastAsia="es-CL"/>
+              </w:rPr>
+              <w:t>Actividades principales</w:t>
             </w:r>
           </w:p>
         </w:tc>
         <w:tc>
           <w:tcPr>
-            <w:tcW w:w="1440" w:type="dxa"/>
+            <w:tcW w:w="1448" w:type="dxa"/>
+            <w:tcBorders>
+              <w:top w:val="single" w:sz="4" w:space="0" w:color="156082"/>
+              <w:left w:val="nil"/>
+              <w:bottom w:val="nil"/>
+              <w:right w:val="nil"/>
+            </w:tcBorders>
+            <w:shd w:val="clear" w:color="156082" w:fill="156082"/>
+            <w:vAlign w:val="center"/>
+            <w:hideMark/>
           </w:tcPr>
           <w:p>
-            <w:r>
-              <w:t>Responsable</w:t>
+            <w:pPr>
+              <w:spacing w:after="0" w:line="240" w:lineRule="auto"/>
+              <w:jc w:val="center"/>
+              <w:rPr>
+                <w:rFonts w:ascii="Aptos Narrow" w:eastAsia="Times New Roman" w:hAnsi="Aptos Narrow" w:cs="Times New Roman"/>
+                <w:b/>
+                <w:bCs/>
+                <w:color w:val="FFFFFF"/>
+                <w:lang w:val="es-CL" w:eastAsia="es-CL"/>
+              </w:rPr>
+            </w:pPr>
+            <w:r>
+              <w:rPr>
+                <w:rFonts w:ascii="Aptos Narrow" w:eastAsia="Times New Roman" w:hAnsi="Aptos Narrow" w:cs="Times New Roman"/>
+                <w:b/>
+                <w:bCs/>
+                <w:color w:val="FFFFFF"/>
+                <w:lang w:val="es-CL" w:eastAsia="es-CL"/>
+              </w:rPr>
+              <w:t>Responsable(s)</w:t>
             </w:r>
           </w:p>
         </w:tc>
         <w:tc>
           <w:tcPr>
-            <w:tcW w:w="1440" w:type="dxa"/>
+            <w:tcW w:w="1388" w:type="dxa"/>
+            <w:tcBorders>
+              <w:top w:val="single" w:sz="4" w:space="0" w:color="156082"/>
+              <w:left w:val="nil"/>
+              <w:bottom w:val="nil"/>
+              <w:right w:val="nil"/>
+            </w:tcBorders>
+            <w:shd w:val="clear" w:color="156082" w:fill="156082"/>
+            <w:vAlign w:val="center"/>
+            <w:hideMark/>
           </w:tcPr>
           <w:p>
-            <w:r>
+            <w:pPr>
+              <w:spacing w:after="0" w:line="240" w:lineRule="auto"/>
+              <w:jc w:val="center"/>
+              <w:rPr>
+                <w:rFonts w:ascii="Aptos Narrow" w:eastAsia="Times New Roman" w:hAnsi="Aptos Narrow" w:cs="Times New Roman"/>
+                <w:b/>
+                <w:bCs/>
+                <w:color w:val="FFFFFF"/>
+                <w:lang w:val="es-CL" w:eastAsia="es-CL"/>
+              </w:rPr>
+            </w:pPr>
+            <w:r>
+              <w:rPr>
+                <w:rFonts w:ascii="Aptos Narrow" w:eastAsia="Times New Roman" w:hAnsi="Aptos Narrow" w:cs="Times New Roman"/>
+                <w:b/>
+                <w:bCs/>
+                <w:color w:val="FFFFFF"/>
+                <w:lang w:val="es-CL" w:eastAsia="es-CL"/>
+              </w:rPr>
               <w:t>Recursos</w:t>
             </w:r>
           </w:p>
         </w:tc>
         <w:tc>
           <w:tcPr>
-            <w:tcW w:w="1440" w:type="dxa"/>
+            <w:tcW w:w="1527" w:type="dxa"/>
+            <w:tcBorders>
+              <w:top w:val="single" w:sz="4" w:space="0" w:color="156082"/>
+              <w:left w:val="nil"/>
+              <w:bottom w:val="nil"/>
+              <w:right w:val="nil"/>
+            </w:tcBorders>
+            <w:shd w:val="clear" w:color="156082" w:fill="156082"/>
+            <w:vAlign w:val="center"/>
+            <w:hideMark/>
           </w:tcPr>
           <w:p>
-            <w:r>
-              <w:t>Entregable / Evidencia</w:t>
+            <w:pPr>
+              <w:spacing w:after="0" w:line="240" w:lineRule="auto"/>
+              <w:jc w:val="center"/>
+              <w:rPr>
+                <w:rFonts w:ascii="Aptos Narrow" w:eastAsia="Times New Roman" w:hAnsi="Aptos Narrow" w:cs="Times New Roman"/>
+                <w:b/>
+                <w:bCs/>
+                <w:color w:val="FFFFFF"/>
+                <w:lang w:val="es-CL" w:eastAsia="es-CL"/>
+              </w:rPr>
+            </w:pPr>
+            <w:r>
+              <w:rPr>
+                <w:rFonts w:ascii="Aptos Narrow" w:eastAsia="Times New Roman" w:hAnsi="Aptos Narrow" w:cs="Times New Roman"/>
+                <w:b/>
+                <w:bCs/>
+                <w:color w:val="FFFFFF"/>
+                <w:lang w:val="es-CL" w:eastAsia="es-CL"/>
+              </w:rPr>
+              <w:t>Entregables / Evidencias</w:t>
             </w:r>
           </w:p>
         </w:tc>
         <w:tc>
           <w:tcPr>
-            <w:tcW w:w="1440" w:type="dxa"/>
+            <w:tcW w:w="1284" w:type="dxa"/>
+            <w:tcBorders>
+              <w:top w:val="single" w:sz="4" w:space="0" w:color="156082"/>
+              <w:left w:val="nil"/>
+              <w:bottom w:val="nil"/>
+              <w:right w:val="single" w:sz="4" w:space="0" w:color="156082"/>
+            </w:tcBorders>
+            <w:shd w:val="clear" w:color="156082" w:fill="156082"/>
+            <w:vAlign w:val="center"/>
+            <w:hideMark/>
           </w:tcPr>
           <w:p>
-            <w:r>
-              <w:t>Observaciones</w:t>
+            <w:pPr>
+              <w:spacing w:after="0" w:line="240" w:lineRule="auto"/>
+              <w:jc w:val="center"/>
+              <w:rPr>
+                <w:rFonts w:ascii="Aptos Narrow" w:eastAsia="Times New Roman" w:hAnsi="Aptos Narrow" w:cs="Times New Roman"/>
+                <w:b/>
+                <w:bCs/>
+                <w:color w:val="FFFFFF"/>
+                <w:lang w:val="es-CL" w:eastAsia="es-CL"/>
+              </w:rPr>
+            </w:pPr>
+            <w:r>
+              <w:rPr>
+                <w:rFonts w:ascii="Aptos Narrow" w:eastAsia="Times New Roman" w:hAnsi="Aptos Narrow" w:cs="Times New Roman"/>
+                <w:b/>
+                <w:bCs/>
+                <w:color w:val="FFFFFF"/>
+                <w:lang w:val="es-CL" w:eastAsia="es-CL"/>
+              </w:rPr>
+              <w:t>Semana estimada</w:t>
             </w:r>
           </w:p>
         </w:tc>
       </w:tr>
       <w:tr>
         <w:trPr>
-          <w:jc w:val="center"/>
+          <w:trHeight w:val="2016"/>
         </w:trPr>
         <w:tc>
           <w:tcPr>
-            <w:tcW w:w="1440" w:type="dxa"/>
+            <w:tcW w:w="1250" w:type="dxa"/>
+            <w:tcBorders>
+              <w:top w:val="single" w:sz="4" w:space="0" w:color="156082"/>
+              <w:left w:val="single" w:sz="4" w:space="0" w:color="156082"/>
+              <w:bottom w:val="nil"/>
+              <w:right w:val="nil"/>
+            </w:tcBorders>
+            <w:vAlign w:val="center"/>
+            <w:hideMark/>
           </w:tcPr>
           <w:p>
-            <w:r>
-              <w:t>S1</w:t>
+            <w:pPr>
+              <w:spacing w:after="0" w:line="240" w:lineRule="auto"/>
+              <w:rPr>
+                <w:rFonts w:ascii="Aptos Narrow" w:eastAsia="Times New Roman" w:hAnsi="Aptos Narrow" w:cs="Times New Roman"/>
+                <w:b/>
+                <w:bCs/>
+                <w:color w:val="000000"/>
+                <w:lang w:val="es-CL" w:eastAsia="es-CL"/>
+              </w:rPr>
+            </w:pPr>
+            <w:r>
+              <w:rPr>
+                <w:rFonts w:ascii="Aptos Narrow" w:eastAsia="Times New Roman" w:hAnsi="Aptos Narrow" w:cs="Times New Roman"/>
+                <w:b/>
+                <w:bCs/>
+                <w:color w:val="000000"/>
+                <w:lang w:val="es-CL" w:eastAsia="es-CL"/>
+              </w:rPr>
+              <w:t>Fase 1 – Definición del Proyecto</w:t>
             </w:r>
           </w:p>
         </w:tc>
         <w:tc>
           <w:tcPr>
-            <w:tcW w:w="1440" w:type="dxa"/>
+            <w:tcW w:w="2403" w:type="dxa"/>
+            <w:tcBorders>
+              <w:top w:val="single" w:sz="4" w:space="0" w:color="156082"/>
+              <w:left w:val="nil"/>
+              <w:bottom w:val="nil"/>
+              <w:right w:val="nil"/>
+            </w:tcBorders>
+            <w:vAlign w:val="center"/>
+            <w:hideMark/>
           </w:tcPr>
           <w:p>
-            <w:proofErr w:type="spellStart"/>
-            <w:r>
-              <w:t>Kick</w:t>
-            </w:r>
-            <w:proofErr w:type="spellEnd"/>
-            <w:r>
-              <w:t xml:space="preserve">-off, definición de roles, creación </w:t>
-            </w:r>
-            <w:r>
-              <w:lastRenderedPageBreak/>
-              <w:t>de repo y README</w:t>
+            <w:pPr>
+              <w:spacing w:after="0" w:line="240" w:lineRule="auto"/>
+              <w:rPr>
+                <w:rFonts w:ascii="Aptos Narrow" w:eastAsia="Times New Roman" w:hAnsi="Aptos Narrow" w:cs="Times New Roman"/>
+                <w:color w:val="000000"/>
+                <w:lang w:val="es-CL" w:eastAsia="es-CL"/>
+              </w:rPr>
+            </w:pPr>
+            <w:r>
+              <w:rPr>
+                <w:rFonts w:ascii="Aptos Narrow" w:eastAsia="Times New Roman" w:hAnsi="Aptos Narrow" w:cs="Times New Roman"/>
+                <w:color w:val="000000"/>
+                <w:lang w:val="es-CL" w:eastAsia="es-CL"/>
+              </w:rPr>
+              <w:t>Acta de constitución, definición de objetivos, alcance, requerimientos y análisis de factibilidad. Diseño inicial de arquitectura y modelo de datos.</w:t>
             </w:r>
           </w:p>
         </w:tc>
         <w:tc>
           <w:tcPr>
-            <w:tcW w:w="1440" w:type="dxa"/>
+            <w:tcW w:w="1448" w:type="dxa"/>
+            <w:tcBorders>
+              <w:top w:val="single" w:sz="4" w:space="0" w:color="156082"/>
+              <w:left w:val="nil"/>
+              <w:bottom w:val="nil"/>
+              <w:right w:val="nil"/>
+            </w:tcBorders>
+            <w:vAlign w:val="center"/>
+            <w:hideMark/>
           </w:tcPr>
           <w:p>
-            <w:r>
-              <w:lastRenderedPageBreak/>
-              <w:t xml:space="preserve">Raúl / </w:t>
-            </w:r>
-            <w:r>
-              <w:lastRenderedPageBreak/>
-              <w:t>Matías</w:t>
+            <w:pPr>
+              <w:spacing w:after="0" w:line="240" w:lineRule="auto"/>
+              <w:rPr>
+                <w:rFonts w:ascii="Aptos Narrow" w:eastAsia="Times New Roman" w:hAnsi="Aptos Narrow" w:cs="Times New Roman"/>
+                <w:color w:val="000000"/>
+                <w:lang w:val="es-CL" w:eastAsia="es-CL"/>
+              </w:rPr>
+            </w:pPr>
+            <w:r>
+              <w:rPr>
+                <w:rFonts w:ascii="Aptos Narrow" w:eastAsia="Times New Roman" w:hAnsi="Aptos Narrow" w:cs="Times New Roman"/>
+                <w:color w:val="000000"/>
+                <w:lang w:val="es-CL" w:eastAsia="es-CL"/>
+              </w:rPr>
+              <w:t>Matías / Raúl</w:t>
             </w:r>
           </w:p>
         </w:tc>
         <w:tc>
           <w:tcPr>
-            <w:tcW w:w="1440" w:type="dxa"/>
+            <w:tcW w:w="1388" w:type="dxa"/>
+            <w:tcBorders>
+              <w:top w:val="single" w:sz="4" w:space="0" w:color="156082"/>
+              <w:left w:val="nil"/>
+              <w:bottom w:val="nil"/>
+              <w:right w:val="nil"/>
+            </w:tcBorders>
+            <w:vAlign w:val="center"/>
+            <w:hideMark/>
           </w:tcPr>
           <w:p>
-            <w:r>
-              <w:lastRenderedPageBreak/>
-              <w:t xml:space="preserve">Git/GitHub, </w:t>
-            </w:r>
-            <w:r>
-              <w:lastRenderedPageBreak/>
-              <w:t xml:space="preserve">VS </w:t>
+            <w:pPr>
+              <w:spacing w:after="0" w:line="240" w:lineRule="auto"/>
+              <w:rPr>
+                <w:rFonts w:ascii="Aptos Narrow" w:eastAsia="Times New Roman" w:hAnsi="Aptos Narrow" w:cs="Times New Roman"/>
+                <w:color w:val="000000"/>
+                <w:lang w:val="es-CL" w:eastAsia="es-CL"/>
+              </w:rPr>
+            </w:pPr>
+            <w:r>
+              <w:rPr>
+                <w:rFonts w:ascii="Aptos Narrow" w:eastAsia="Times New Roman" w:hAnsi="Aptos Narrow" w:cs="Times New Roman"/>
+                <w:color w:val="000000"/>
+                <w:lang w:val="es-CL" w:eastAsia="es-CL"/>
+              </w:rPr>
+              <w:t>Word, Draw.io, SQL Server</w:t>
+            </w:r>
+          </w:p>
+        </w:tc>
+        <w:tc>
+          <w:tcPr>
+            <w:tcW w:w="1527" w:type="dxa"/>
+            <w:tcBorders>
+              <w:top w:val="single" w:sz="4" w:space="0" w:color="156082"/>
+              <w:left w:val="nil"/>
+              <w:bottom w:val="nil"/>
+              <w:right w:val="nil"/>
+            </w:tcBorders>
+            <w:vAlign w:val="center"/>
+            <w:hideMark/>
+          </w:tcPr>
+          <w:p>
+            <w:pPr>
+              <w:spacing w:after="0" w:line="240" w:lineRule="auto"/>
+              <w:rPr>
+                <w:rFonts w:ascii="Aptos Narrow" w:eastAsia="Times New Roman" w:hAnsi="Aptos Narrow" w:cs="Times New Roman"/>
+                <w:color w:val="000000"/>
+                <w:lang w:val="es-CL" w:eastAsia="es-CL"/>
+              </w:rPr>
+            </w:pPr>
+            <w:r>
+              <w:rPr>
+                <w:rFonts w:ascii="Aptos Narrow" w:eastAsia="Times New Roman" w:hAnsi="Aptos Narrow" w:cs="Times New Roman"/>
+                <w:color w:val="000000"/>
+                <w:lang w:val="es-CL" w:eastAsia="es-CL"/>
+              </w:rPr>
+              <w:t>Documento de definición del proyecto + ERD inicial + arquitectura</w:t>
+            </w:r>
+          </w:p>
+        </w:tc>
+        <w:tc>
+          <w:tcPr>
+            <w:tcW w:w="1284" w:type="dxa"/>
+            <w:tcBorders>
+              <w:top w:val="single" w:sz="4" w:space="0" w:color="156082"/>
+              <w:left w:val="nil"/>
+              <w:bottom w:val="nil"/>
+              <w:right w:val="single" w:sz="4" w:space="0" w:color="156082"/>
+            </w:tcBorders>
+            <w:vAlign w:val="center"/>
+            <w:hideMark/>
+          </w:tcPr>
+          <w:p>
+            <w:pPr>
+              <w:spacing w:after="0" w:line="240" w:lineRule="auto"/>
+              <w:rPr>
+                <w:rFonts w:ascii="Aptos Narrow" w:eastAsia="Times New Roman" w:hAnsi="Aptos Narrow" w:cs="Times New Roman"/>
+                <w:color w:val="000000"/>
+                <w:lang w:val="es-CL" w:eastAsia="es-CL"/>
+              </w:rPr>
+            </w:pPr>
+            <w:r>
+              <w:rPr>
+                <w:rFonts w:ascii="Aptos Narrow" w:eastAsia="Times New Roman" w:hAnsi="Aptos Narrow" w:cs="Times New Roman"/>
+                <w:color w:val="000000"/>
+                <w:lang w:val="es-CL" w:eastAsia="es-CL"/>
+              </w:rPr>
+              <w:t>Semanas 1–3</w:t>
+            </w:r>
+          </w:p>
+        </w:tc>
+      </w:tr>
+      <w:tr>
+        <w:trPr>
+          <w:trHeight w:val="1440"/>
+        </w:trPr>
+        <w:tc>
+          <w:tcPr>
+            <w:tcW w:w="1250" w:type="dxa"/>
+            <w:tcBorders>
+              <w:top w:val="single" w:sz="4" w:space="0" w:color="156082"/>
+              <w:left w:val="single" w:sz="4" w:space="0" w:color="156082"/>
+              <w:bottom w:val="nil"/>
+              <w:right w:val="nil"/>
+            </w:tcBorders>
+            <w:vAlign w:val="center"/>
+            <w:hideMark/>
+          </w:tcPr>
+          <w:p>
+            <w:pPr>
+              <w:spacing w:after="0" w:line="240" w:lineRule="auto"/>
+              <w:rPr>
+                <w:rFonts w:ascii="Aptos Narrow" w:eastAsia="Times New Roman" w:hAnsi="Aptos Narrow" w:cs="Times New Roman"/>
+                <w:b/>
+                <w:bCs/>
+                <w:color w:val="000000"/>
+                <w:lang w:val="es-CL" w:eastAsia="es-CL"/>
+              </w:rPr>
+            </w:pPr>
+            <w:r>
+              <w:rPr>
+                <w:rFonts w:ascii="Aptos Narrow" w:eastAsia="Times New Roman" w:hAnsi="Aptos Narrow" w:cs="Times New Roman"/>
+                <w:b/>
+                <w:bCs/>
+                <w:color w:val="000000"/>
+                <w:lang w:val="es-CL" w:eastAsia="es-CL"/>
+              </w:rPr>
+              <w:t>Fase 2 – Desarrollo Parcial</w:t>
+            </w:r>
+          </w:p>
+        </w:tc>
+        <w:tc>
+          <w:tcPr>
+            <w:tcW w:w="2403" w:type="dxa"/>
+            <w:tcBorders>
+              <w:top w:val="single" w:sz="4" w:space="0" w:color="156082"/>
+              <w:left w:val="nil"/>
+              <w:bottom w:val="nil"/>
+              <w:right w:val="nil"/>
+            </w:tcBorders>
+            <w:vAlign w:val="center"/>
+            <w:hideMark/>
+          </w:tcPr>
+          <w:p>
+            <w:pPr>
+              <w:spacing w:after="0" w:line="240" w:lineRule="auto"/>
+              <w:rPr>
+                <w:rFonts w:ascii="Aptos Narrow" w:eastAsia="Times New Roman" w:hAnsi="Aptos Narrow" w:cs="Times New Roman"/>
+                <w:color w:val="000000"/>
+                <w:lang w:val="es-CL" w:eastAsia="es-CL"/>
+              </w:rPr>
+            </w:pPr>
+            <w:r>
+              <w:rPr>
+                <w:rFonts w:ascii="Aptos Narrow" w:eastAsia="Times New Roman" w:hAnsi="Aptos Narrow" w:cs="Times New Roman"/>
+                <w:color w:val="000000"/>
+                <w:lang w:val="es-CL" w:eastAsia="es-CL"/>
+              </w:rPr>
+              <w:t xml:space="preserve">Desarrollo inicial de </w:t>
             </w:r>
             <w:proofErr w:type="spellStart"/>
             <w:r>
-              <w:t>Code</w:t>
+              <w:rPr>
+                <w:rFonts w:ascii="Aptos Narrow" w:eastAsia="Times New Roman" w:hAnsi="Aptos Narrow" w:cs="Times New Roman"/>
+                <w:color w:val="000000"/>
+                <w:lang w:val="es-CL" w:eastAsia="es-CL"/>
+              </w:rPr>
+              <w:t>backend</w:t>
+            </w:r>
+            <w:proofErr w:type="spellEnd"/>
+            <w:r>
+              <w:rPr>
+                <w:rFonts w:ascii="Aptos Narrow" w:eastAsia="Times New Roman" w:hAnsi="Aptos Narrow" w:cs="Times New Roman"/>
+                <w:color w:val="000000"/>
+                <w:lang w:val="es-CL" w:eastAsia="es-CL"/>
+              </w:rPr>
+              <w:t xml:space="preserve"> (.NET: autenticación, agenda) y </w:t>
+            </w:r>
+            <w:proofErr w:type="spellStart"/>
+            <w:r>
+              <w:rPr>
+                <w:rFonts w:ascii="Aptos Narrow" w:eastAsia="Times New Roman" w:hAnsi="Aptos Narrow" w:cs="Times New Roman"/>
+                <w:color w:val="000000"/>
+                <w:lang w:val="es-CL" w:eastAsia="es-CL"/>
+              </w:rPr>
+              <w:t>frontend</w:t>
+            </w:r>
+            <w:proofErr w:type="spellEnd"/>
+            <w:r>
+              <w:rPr>
+                <w:rFonts w:ascii="Aptos Narrow" w:eastAsia="Times New Roman" w:hAnsi="Aptos Narrow" w:cs="Times New Roman"/>
+                <w:color w:val="000000"/>
+                <w:lang w:val="es-CL" w:eastAsia="es-CL"/>
+              </w:rPr>
+              <w:t xml:space="preserve"> básico (</w:t>
+            </w:r>
+            <w:proofErr w:type="spellStart"/>
+            <w:r>
+              <w:rPr>
+                <w:rFonts w:ascii="Aptos Narrow" w:eastAsia="Times New Roman" w:hAnsi="Aptos Narrow" w:cs="Times New Roman"/>
+                <w:color w:val="000000"/>
+                <w:lang w:val="es-CL" w:eastAsia="es-CL"/>
+              </w:rPr>
+              <w:t>login</w:t>
+            </w:r>
+            <w:proofErr w:type="spellEnd"/>
+            <w:r>
+              <w:rPr>
+                <w:rFonts w:ascii="Aptos Narrow" w:eastAsia="Times New Roman" w:hAnsi="Aptos Narrow" w:cs="Times New Roman"/>
+                <w:color w:val="000000"/>
+                <w:lang w:val="es-CL" w:eastAsia="es-CL"/>
+              </w:rPr>
+              <w:t>, agendamiento).</w:t>
+            </w:r>
+          </w:p>
+        </w:tc>
+        <w:tc>
+          <w:tcPr>
+            <w:tcW w:w="1448" w:type="dxa"/>
+            <w:tcBorders>
+              <w:top w:val="single" w:sz="4" w:space="0" w:color="156082"/>
+              <w:left w:val="nil"/>
+              <w:bottom w:val="nil"/>
+              <w:right w:val="nil"/>
+            </w:tcBorders>
+            <w:vAlign w:val="center"/>
+            <w:hideMark/>
+          </w:tcPr>
+          <w:p>
+            <w:pPr>
+              <w:spacing w:after="0" w:line="240" w:lineRule="auto"/>
+              <w:rPr>
+                <w:rFonts w:ascii="Aptos Narrow" w:eastAsia="Times New Roman" w:hAnsi="Aptos Narrow" w:cs="Times New Roman"/>
+                <w:color w:val="000000"/>
+                <w:lang w:val="es-CL" w:eastAsia="es-CL"/>
+              </w:rPr>
+            </w:pPr>
+            <w:r>
+              <w:rPr>
+                <w:rFonts w:ascii="Aptos Narrow" w:eastAsia="Times New Roman" w:hAnsi="Aptos Narrow" w:cs="Times New Roman"/>
+                <w:color w:val="000000"/>
+                <w:lang w:val="es-CL" w:eastAsia="es-CL"/>
+              </w:rPr>
+              <w:t>Matías (</w:t>
+            </w:r>
+            <w:proofErr w:type="spellStart"/>
+            <w:r>
+              <w:rPr>
+                <w:rFonts w:ascii="Aptos Narrow" w:eastAsia="Times New Roman" w:hAnsi="Aptos Narrow" w:cs="Times New Roman"/>
+                <w:color w:val="000000"/>
+                <w:lang w:val="es-CL" w:eastAsia="es-CL"/>
+              </w:rPr>
+              <w:t>backend</w:t>
+            </w:r>
+            <w:proofErr w:type="spellEnd"/>
+            <w:r>
+              <w:rPr>
+                <w:rFonts w:ascii="Aptos Narrow" w:eastAsia="Times New Roman" w:hAnsi="Aptos Narrow" w:cs="Times New Roman"/>
+                <w:color w:val="000000"/>
+                <w:lang w:val="es-CL" w:eastAsia="es-CL"/>
+              </w:rPr>
+              <w:t>), Raúl (</w:t>
+            </w:r>
+            <w:proofErr w:type="spellStart"/>
+            <w:r>
+              <w:rPr>
+                <w:rFonts w:ascii="Aptos Narrow" w:eastAsia="Times New Roman" w:hAnsi="Aptos Narrow" w:cs="Times New Roman"/>
+                <w:color w:val="000000"/>
+                <w:lang w:val="es-CL" w:eastAsia="es-CL"/>
+              </w:rPr>
+              <w:t>frontend</w:t>
+            </w:r>
+            <w:proofErr w:type="spellEnd"/>
+            <w:r>
+              <w:rPr>
+                <w:rFonts w:ascii="Aptos Narrow" w:eastAsia="Times New Roman" w:hAnsi="Aptos Narrow" w:cs="Times New Roman"/>
+                <w:color w:val="000000"/>
+                <w:lang w:val="es-CL" w:eastAsia="es-CL"/>
+              </w:rPr>
+              <w:t>)</w:t>
+            </w:r>
+          </w:p>
+        </w:tc>
+        <w:tc>
+          <w:tcPr>
+            <w:tcW w:w="1388" w:type="dxa"/>
+            <w:tcBorders>
+              <w:top w:val="single" w:sz="4" w:space="0" w:color="156082"/>
+              <w:left w:val="nil"/>
+              <w:bottom w:val="nil"/>
+              <w:right w:val="nil"/>
+            </w:tcBorders>
+            <w:vAlign w:val="center"/>
+            <w:hideMark/>
+          </w:tcPr>
+          <w:p>
+            <w:pPr>
+              <w:spacing w:after="0" w:line="240" w:lineRule="auto"/>
+              <w:rPr>
+                <w:rFonts w:ascii="Aptos Narrow" w:eastAsia="Times New Roman" w:hAnsi="Aptos Narrow" w:cs="Times New Roman"/>
+                <w:color w:val="000000"/>
+                <w:lang w:val="es-CL" w:eastAsia="es-CL"/>
+              </w:rPr>
+            </w:pPr>
+            <w:r>
+              <w:rPr>
+                <w:rFonts w:ascii="Aptos Narrow" w:eastAsia="Times New Roman" w:hAnsi="Aptos Narrow" w:cs="Times New Roman"/>
+                <w:color w:val="000000"/>
+                <w:lang w:val="es-CL" w:eastAsia="es-CL"/>
+              </w:rPr>
+              <w:t xml:space="preserve">.NET 8, </w:t>
+            </w:r>
+            <w:proofErr w:type="spellStart"/>
+            <w:r>
+              <w:rPr>
+                <w:rFonts w:ascii="Aptos Narrow" w:eastAsia="Times New Roman" w:hAnsi="Aptos Narrow" w:cs="Times New Roman"/>
+                <w:color w:val="000000"/>
+                <w:lang w:val="es-CL" w:eastAsia="es-CL"/>
+              </w:rPr>
+              <w:t>React</w:t>
+            </w:r>
+            <w:proofErr w:type="spellEnd"/>
+            <w:r>
+              <w:rPr>
+                <w:rFonts w:ascii="Aptos Narrow" w:eastAsia="Times New Roman" w:hAnsi="Aptos Narrow" w:cs="Times New Roman"/>
+                <w:color w:val="000000"/>
+                <w:lang w:val="es-CL" w:eastAsia="es-CL"/>
+              </w:rPr>
+              <w:t>, SQL Server</w:t>
+            </w:r>
+          </w:p>
+        </w:tc>
+        <w:tc>
+          <w:tcPr>
+            <w:tcW w:w="1527" w:type="dxa"/>
+            <w:tcBorders>
+              <w:top w:val="single" w:sz="4" w:space="0" w:color="156082"/>
+              <w:left w:val="nil"/>
+              <w:bottom w:val="nil"/>
+              <w:right w:val="nil"/>
+            </w:tcBorders>
+            <w:vAlign w:val="center"/>
+            <w:hideMark/>
+          </w:tcPr>
+          <w:p>
+            <w:pPr>
+              <w:spacing w:after="0" w:line="240" w:lineRule="auto"/>
+              <w:rPr>
+                <w:rFonts w:ascii="Aptos Narrow" w:eastAsia="Times New Roman" w:hAnsi="Aptos Narrow" w:cs="Times New Roman"/>
+                <w:color w:val="000000"/>
+                <w:lang w:val="es-CL" w:eastAsia="es-CL"/>
+              </w:rPr>
+            </w:pPr>
+            <w:r>
+              <w:rPr>
+                <w:rFonts w:ascii="Aptos Narrow" w:eastAsia="Times New Roman" w:hAnsi="Aptos Narrow" w:cs="Times New Roman"/>
+                <w:color w:val="000000"/>
+                <w:lang w:val="es-CL" w:eastAsia="es-CL"/>
+              </w:rPr>
+              <w:t>Prototipo funcional parcial (</w:t>
+            </w:r>
+            <w:proofErr w:type="spellStart"/>
+            <w:r>
+              <w:rPr>
+                <w:rFonts w:ascii="Aptos Narrow" w:eastAsia="Times New Roman" w:hAnsi="Aptos Narrow" w:cs="Times New Roman"/>
+                <w:color w:val="000000"/>
+                <w:lang w:val="es-CL" w:eastAsia="es-CL"/>
+              </w:rPr>
+              <w:t>login</w:t>
+            </w:r>
+            <w:proofErr w:type="spellEnd"/>
+            <w:r>
+              <w:rPr>
+                <w:rFonts w:ascii="Aptos Narrow" w:eastAsia="Times New Roman" w:hAnsi="Aptos Narrow" w:cs="Times New Roman"/>
+                <w:color w:val="000000"/>
+                <w:lang w:val="es-CL" w:eastAsia="es-CL"/>
+              </w:rPr>
+              <w:t xml:space="preserve"> + agenda) + colección </w:t>
+            </w:r>
+            <w:proofErr w:type="spellStart"/>
+            <w:r>
+              <w:rPr>
+                <w:rFonts w:ascii="Aptos Narrow" w:eastAsia="Times New Roman" w:hAnsi="Aptos Narrow" w:cs="Times New Roman"/>
+                <w:color w:val="000000"/>
+                <w:lang w:val="es-CL" w:eastAsia="es-CL"/>
+              </w:rPr>
+              <w:t>Postman</w:t>
             </w:r>
             <w:proofErr w:type="spellEnd"/>
           </w:p>
         </w:tc>
         <w:tc>
           <w:tcPr>
-            <w:tcW w:w="1440" w:type="dxa"/>
+            <w:tcW w:w="1284" w:type="dxa"/>
+            <w:tcBorders>
+              <w:top w:val="single" w:sz="4" w:space="0" w:color="156082"/>
+              <w:left w:val="nil"/>
+              <w:bottom w:val="nil"/>
+              <w:right w:val="single" w:sz="4" w:space="0" w:color="156082"/>
+            </w:tcBorders>
+            <w:vAlign w:val="center"/>
+            <w:hideMark/>
           </w:tcPr>
           <w:p>
-            <w:r>
-              <w:lastRenderedPageBreak/>
-              <w:t xml:space="preserve">Repo inicial + </w:t>
-            </w:r>
-            <w:r>
-              <w:lastRenderedPageBreak/>
-              <w:t>README</w:t>
-            </w:r>
-          </w:p>
-        </w:tc>
-        <w:tc>
-          <w:tcPr>
-            <w:tcW w:w="1440" w:type="dxa"/>
-          </w:tcPr>
-          <w:p>
-            <w:r>
-              <w:lastRenderedPageBreak/>
-              <w:t xml:space="preserve">Facilitador: experiencia </w:t>
-            </w:r>
-            <w:r>
-              <w:lastRenderedPageBreak/>
-              <w:t>previa; Riesgo: tiempos; Mitigación: alcance MVP</w:t>
+            <w:pPr>
+              <w:spacing w:after="0" w:line="240" w:lineRule="auto"/>
+              <w:rPr>
+                <w:rFonts w:ascii="Aptos Narrow" w:eastAsia="Times New Roman" w:hAnsi="Aptos Narrow" w:cs="Times New Roman"/>
+                <w:color w:val="000000"/>
+                <w:lang w:val="es-CL" w:eastAsia="es-CL"/>
+              </w:rPr>
+            </w:pPr>
+            <w:r>
+              <w:rPr>
+                <w:rFonts w:ascii="Aptos Narrow" w:eastAsia="Times New Roman" w:hAnsi="Aptos Narrow" w:cs="Times New Roman"/>
+                <w:color w:val="000000"/>
+                <w:lang w:val="es-CL" w:eastAsia="es-CL"/>
+              </w:rPr>
+              <w:t>Semanas 4–7</w:t>
             </w:r>
           </w:p>
         </w:tc>
       </w:tr>
       <w:tr>
         <w:trPr>
-          <w:jc w:val="center"/>
+          <w:trHeight w:val="1728"/>
         </w:trPr>
         <w:tc>
           <w:tcPr>
-            <w:tcW w:w="1440" w:type="dxa"/>
+            <w:tcW w:w="1250" w:type="dxa"/>
+            <w:tcBorders>
+              <w:top w:val="single" w:sz="4" w:space="0" w:color="156082"/>
+              <w:left w:val="single" w:sz="4" w:space="0" w:color="156082"/>
+              <w:bottom w:val="nil"/>
+              <w:right w:val="nil"/>
+            </w:tcBorders>
+            <w:vAlign w:val="center"/>
+            <w:hideMark/>
           </w:tcPr>
           <w:p>
-            <w:r>
-              <w:lastRenderedPageBreak/>
-              <w:t>S2</w:t>
+            <w:pPr>
+              <w:spacing w:after="0" w:line="240" w:lineRule="auto"/>
+              <w:rPr>
+                <w:rFonts w:ascii="Aptos Narrow" w:eastAsia="Times New Roman" w:hAnsi="Aptos Narrow" w:cs="Times New Roman"/>
+                <w:b/>
+                <w:bCs/>
+                <w:color w:val="000000"/>
+                <w:lang w:val="es-CL" w:eastAsia="es-CL"/>
+              </w:rPr>
+            </w:pPr>
+            <w:r>
+              <w:rPr>
+                <w:rFonts w:ascii="Aptos Narrow" w:eastAsia="Times New Roman" w:hAnsi="Aptos Narrow" w:cs="Times New Roman"/>
+                <w:b/>
+                <w:bCs/>
+                <w:color w:val="000000"/>
+                <w:lang w:val="es-CL" w:eastAsia="es-CL"/>
+              </w:rPr>
+              <w:t>Fase 3 – Desarrollo Avanzado y Pruebas</w:t>
             </w:r>
           </w:p>
         </w:tc>
         <w:tc>
           <w:tcPr>
-            <w:tcW w:w="1440" w:type="dxa"/>
+            <w:tcW w:w="2403" w:type="dxa"/>
+            <w:tcBorders>
+              <w:top w:val="single" w:sz="4" w:space="0" w:color="156082"/>
+              <w:left w:val="nil"/>
+              <w:bottom w:val="nil"/>
+              <w:right w:val="nil"/>
+            </w:tcBorders>
+            <w:vAlign w:val="center"/>
+            <w:hideMark/>
           </w:tcPr>
           <w:p>
-            <w:r>
-              <w:t>Levantamiento de requerimientos y diseño de datos (ERD); arquitectura</w:t>
+            <w:pPr>
+              <w:spacing w:after="0" w:line="240" w:lineRule="auto"/>
+              <w:rPr>
+                <w:rFonts w:ascii="Aptos Narrow" w:eastAsia="Times New Roman" w:hAnsi="Aptos Narrow" w:cs="Times New Roman"/>
+                <w:color w:val="000000"/>
+                <w:lang w:val="es-CL" w:eastAsia="es-CL"/>
+              </w:rPr>
+            </w:pPr>
+            <w:r>
+              <w:rPr>
+                <w:rFonts w:ascii="Aptos Narrow" w:eastAsia="Times New Roman" w:hAnsi="Aptos Narrow" w:cs="Times New Roman"/>
+                <w:color w:val="000000"/>
+                <w:lang w:val="es-CL" w:eastAsia="es-CL"/>
+              </w:rPr>
+              <w:t>Implementación del cuestionario de síntomas, motor de reglas, panel médico y reportes simples. Ejecución de pruebas unitarias e integración.</w:t>
             </w:r>
           </w:p>
         </w:tc>
         <w:tc>
           <w:tcPr>
-            <w:tcW w:w="1440" w:type="dxa"/>
+            <w:tcW w:w="1448" w:type="dxa"/>
+            <w:tcBorders>
+              <w:top w:val="single" w:sz="4" w:space="0" w:color="156082"/>
+              <w:left w:val="nil"/>
+              <w:bottom w:val="nil"/>
+              <w:right w:val="nil"/>
+            </w:tcBorders>
+            <w:vAlign w:val="center"/>
+            <w:hideMark/>
           </w:tcPr>
           <w:p>
-            <w:r>
-              <w:t>Raúl / Matías</w:t>
+            <w:pPr>
+              <w:spacing w:after="0" w:line="240" w:lineRule="auto"/>
+              <w:rPr>
+                <w:rFonts w:ascii="Aptos Narrow" w:eastAsia="Times New Roman" w:hAnsi="Aptos Narrow" w:cs="Times New Roman"/>
+                <w:color w:val="000000"/>
+                <w:lang w:val="es-CL" w:eastAsia="es-CL"/>
+              </w:rPr>
+            </w:pPr>
+            <w:r>
+              <w:rPr>
+                <w:rFonts w:ascii="Aptos Narrow" w:eastAsia="Times New Roman" w:hAnsi="Aptos Narrow" w:cs="Times New Roman"/>
+                <w:color w:val="000000"/>
+                <w:lang w:val="es-CL" w:eastAsia="es-CL"/>
+              </w:rPr>
+              <w:t>Ambos</w:t>
             </w:r>
           </w:p>
         </w:tc>
         <w:tc>
           <w:tcPr>
-            <w:tcW w:w="1440" w:type="dxa"/>
+            <w:tcW w:w="1388" w:type="dxa"/>
+            <w:tcBorders>
+              <w:top w:val="single" w:sz="4" w:space="0" w:color="156082"/>
+              <w:left w:val="nil"/>
+              <w:bottom w:val="nil"/>
+              <w:right w:val="nil"/>
+            </w:tcBorders>
+            <w:vAlign w:val="center"/>
+            <w:hideMark/>
           </w:tcPr>
           <w:p>
-            <w:r>
-              <w:t xml:space="preserve">Draw.io, SQL Server, </w:t>
+            <w:pPr>
+              <w:spacing w:after="0" w:line="240" w:lineRule="auto"/>
+              <w:rPr>
+                <w:rFonts w:ascii="Aptos Narrow" w:eastAsia="Times New Roman" w:hAnsi="Aptos Narrow" w:cs="Times New Roman"/>
+                <w:color w:val="000000"/>
+                <w:lang w:val="es-CL" w:eastAsia="es-CL"/>
+              </w:rPr>
+            </w:pPr>
+            <w:r>
+              <w:rPr>
+                <w:rFonts w:ascii="Aptos Narrow" w:eastAsia="Times New Roman" w:hAnsi="Aptos Narrow" w:cs="Times New Roman"/>
+                <w:color w:val="000000"/>
+                <w:lang w:val="es-CL" w:eastAsia="es-CL"/>
+              </w:rPr>
+              <w:t xml:space="preserve">.NET 8, </w:t>
             </w:r>
             <w:proofErr w:type="spellStart"/>
             <w:r>
-              <w:t>Notion</w:t>
+              <w:rPr>
+                <w:rFonts w:ascii="Aptos Narrow" w:eastAsia="Times New Roman" w:hAnsi="Aptos Narrow" w:cs="Times New Roman"/>
+                <w:color w:val="000000"/>
+                <w:lang w:val="es-CL" w:eastAsia="es-CL"/>
+              </w:rPr>
+              <w:t>React</w:t>
             </w:r>
             <w:proofErr w:type="spellEnd"/>
             <w:r>
-              <w:t>/</w:t>
+              <w:rPr>
+                <w:rFonts w:ascii="Aptos Narrow" w:eastAsia="Times New Roman" w:hAnsi="Aptos Narrow" w:cs="Times New Roman"/>
+                <w:color w:val="000000"/>
+                <w:lang w:val="es-CL" w:eastAsia="es-CL"/>
+              </w:rPr>
+              <w:t xml:space="preserve">, </w:t>
             </w:r>
             <w:proofErr w:type="spellStart"/>
             <w:r>
-              <w:t>Docs</w:t>
+              <w:rPr>
+                <w:rFonts w:ascii="Aptos Narrow" w:eastAsia="Times New Roman" w:hAnsi="Aptos Narrow" w:cs="Times New Roman"/>
+                <w:color w:val="000000"/>
+                <w:lang w:val="es-CL" w:eastAsia="es-CL"/>
+              </w:rPr>
+              <w:t>Postman</w:t>
             </w:r>
             <w:proofErr w:type="spellEnd"/>
           </w:p>
         </w:tc>
         <w:tc>
           <w:tcPr>
-            <w:tcW w:w="1440" w:type="dxa"/>
+            <w:tcW w:w="1527" w:type="dxa"/>
+            <w:tcBorders>
+              <w:top w:val="single" w:sz="4" w:space="0" w:color="156082"/>
+              <w:left w:val="nil"/>
+              <w:bottom w:val="nil"/>
+              <w:right w:val="nil"/>
+            </w:tcBorders>
+            <w:vAlign w:val="center"/>
+            <w:hideMark/>
           </w:tcPr>
           <w:p>
-            <w:r>
-              <w:t>Documento de requerimientos + ERD + Diagrama arquitectura</w:t>
+            <w:pPr>
+              <w:spacing w:after="0" w:line="240" w:lineRule="auto"/>
+              <w:rPr>
+                <w:rFonts w:ascii="Aptos Narrow" w:eastAsia="Times New Roman" w:hAnsi="Aptos Narrow" w:cs="Times New Roman"/>
+                <w:color w:val="000000"/>
+                <w:lang w:val="es-CL" w:eastAsia="es-CL"/>
+              </w:rPr>
+            </w:pPr>
+            <w:r>
+              <w:rPr>
+                <w:rFonts w:ascii="Aptos Narrow" w:eastAsia="Times New Roman" w:hAnsi="Aptos Narrow" w:cs="Times New Roman"/>
+                <w:color w:val="000000"/>
+                <w:lang w:val="es-CL" w:eastAsia="es-CL"/>
+              </w:rPr>
+              <w:t>MVP completo (</w:t>
+            </w:r>
+            <w:proofErr w:type="spellStart"/>
+            <w:r>
+              <w:rPr>
+                <w:rFonts w:ascii="Aptos Narrow" w:eastAsia="Times New Roman" w:hAnsi="Aptos Narrow" w:cs="Times New Roman"/>
+                <w:color w:val="000000"/>
+                <w:lang w:val="es-CL" w:eastAsia="es-CL"/>
+              </w:rPr>
+              <w:t>MediTriage</w:t>
+            </w:r>
+            <w:proofErr w:type="spellEnd"/>
+            <w:r>
+              <w:rPr>
+                <w:rFonts w:ascii="Aptos Narrow" w:eastAsia="Times New Roman" w:hAnsi="Aptos Narrow" w:cs="Times New Roman"/>
+                <w:color w:val="000000"/>
+                <w:lang w:val="es-CL" w:eastAsia="es-CL"/>
+              </w:rPr>
+              <w:t>) + reporte de pruebas QA</w:t>
             </w:r>
           </w:p>
         </w:tc>
         <w:tc>
           <w:tcPr>
-            <w:tcW w:w="1440" w:type="dxa"/>
+            <w:tcW w:w="1284" w:type="dxa"/>
+            <w:tcBorders>
+              <w:top w:val="single" w:sz="4" w:space="0" w:color="156082"/>
+              <w:left w:val="nil"/>
+              <w:bottom w:val="nil"/>
+              <w:right w:val="single" w:sz="4" w:space="0" w:color="156082"/>
+            </w:tcBorders>
+            <w:vAlign w:val="center"/>
+            <w:hideMark/>
           </w:tcPr>
           <w:p>
-            <w:r>
-              <w:t>Dependencia: acuerdos de alcance; Mitigación: priorización</w:t>
+            <w:pPr>
+              <w:spacing w:after="0" w:line="240" w:lineRule="auto"/>
+              <w:rPr>
+                <w:rFonts w:ascii="Aptos Narrow" w:eastAsia="Times New Roman" w:hAnsi="Aptos Narrow" w:cs="Times New Roman"/>
+                <w:color w:val="000000"/>
+                <w:lang w:val="es-CL" w:eastAsia="es-CL"/>
+              </w:rPr>
+            </w:pPr>
+            <w:r>
+              <w:rPr>
+                <w:rFonts w:ascii="Aptos Narrow" w:eastAsia="Times New Roman" w:hAnsi="Aptos Narrow" w:cs="Times New Roman"/>
+                <w:color w:val="000000"/>
+                <w:lang w:val="es-CL" w:eastAsia="es-CL"/>
+              </w:rPr>
+              <w:t>Semanas 8–12</w:t>
             </w:r>
           </w:p>
         </w:tc>
       </w:tr>
       <w:tr>
         <w:trPr>
-          <w:jc w:val="center"/>
+          <w:trHeight w:val="1440"/>
         </w:trPr>
         <w:tc>
           <w:tcPr>
-            <w:tcW w:w="1440" w:type="dxa"/>
+            <w:tcW w:w="1250" w:type="dxa"/>
+            <w:tcBorders>
+              <w:top w:val="single" w:sz="4" w:space="0" w:color="156082"/>
+              <w:left w:val="single" w:sz="4" w:space="0" w:color="156082"/>
+              <w:bottom w:val="single" w:sz="4" w:space="0" w:color="156082"/>
+              <w:right w:val="nil"/>
+            </w:tcBorders>
+            <w:vAlign w:val="center"/>
+            <w:hideMark/>
           </w:tcPr>
           <w:p>
-            <w:r>
-              <w:t>S3</w:t>
+            <w:pPr>
+              <w:spacing w:after="0" w:line="240" w:lineRule="auto"/>
+              <w:rPr>
+                <w:rFonts w:ascii="Aptos Narrow" w:eastAsia="Times New Roman" w:hAnsi="Aptos Narrow" w:cs="Times New Roman"/>
+                <w:b/>
+                <w:bCs/>
+                <w:color w:val="000000"/>
+                <w:lang w:val="es-CL" w:eastAsia="es-CL"/>
+              </w:rPr>
+            </w:pPr>
+            <w:r>
+              <w:rPr>
+                <w:rFonts w:ascii="Aptos Narrow" w:eastAsia="Times New Roman" w:hAnsi="Aptos Narrow" w:cs="Times New Roman"/>
+                <w:b/>
+                <w:bCs/>
+                <w:color w:val="000000"/>
+                <w:lang w:val="es-CL" w:eastAsia="es-CL"/>
+              </w:rPr>
+              <w:t>Fase 4 – Cierre y Defensa Final</w:t>
             </w:r>
           </w:p>
         </w:tc>
         <w:tc>
           <w:tcPr>
-            <w:tcW w:w="1440" w:type="dxa"/>
+            <w:tcW w:w="2403" w:type="dxa"/>
+            <w:tcBorders>
+              <w:top w:val="single" w:sz="4" w:space="0" w:color="156082"/>
+              <w:left w:val="nil"/>
+              <w:bottom w:val="single" w:sz="4" w:space="0" w:color="156082"/>
+              <w:right w:val="nil"/>
+            </w:tcBorders>
+            <w:vAlign w:val="center"/>
+            <w:hideMark/>
           </w:tcPr>
           <w:p>
-            <w:r>
-              <w:t xml:space="preserve">Backend </w:t>
-            </w:r>
-            <w:proofErr w:type="spellStart"/>
-            <w:r>
-              <w:t>scaffolding</w:t>
-            </w:r>
-            <w:proofErr w:type="spellEnd"/>
-            <w:r>
-              <w:t xml:space="preserve"> .NET 8, DB </w:t>
-            </w:r>
-            <w:proofErr w:type="spellStart"/>
-            <w:r>
-              <w:t>schema</w:t>
-            </w:r>
-            <w:proofErr w:type="spellEnd"/>
-            <w:r>
-              <w:t xml:space="preserve"> y </w:t>
-            </w:r>
-            <w:proofErr w:type="spellStart"/>
-            <w:r>
-              <w:t>auth</w:t>
-            </w:r>
-            <w:proofErr w:type="spellEnd"/>
-            <w:r>
-              <w:t xml:space="preserve"> JWT (</w:t>
-            </w:r>
-            <w:proofErr w:type="spellStart"/>
-            <w:r>
-              <w:t>endpoints</w:t>
-            </w:r>
-            <w:proofErr w:type="spellEnd"/>
-            <w:r>
-              <w:t xml:space="preserve"> base)</w:t>
+            <w:pPr>
+              <w:spacing w:after="0" w:line="240" w:lineRule="auto"/>
+              <w:rPr>
+                <w:rFonts w:ascii="Aptos Narrow" w:eastAsia="Times New Roman" w:hAnsi="Aptos Narrow" w:cs="Times New Roman"/>
+                <w:color w:val="000000"/>
+                <w:lang w:val="es-CL" w:eastAsia="es-CL"/>
+              </w:rPr>
+            </w:pPr>
+            <w:r>
+              <w:rPr>
+                <w:rFonts w:ascii="Aptos Narrow" w:eastAsia="Times New Roman" w:hAnsi="Aptos Narrow" w:cs="Times New Roman"/>
+                <w:color w:val="000000"/>
+                <w:lang w:val="es-CL" w:eastAsia="es-CL"/>
+              </w:rPr>
+              <w:t>Documentación técnica y de usuario. Preparación de presentación y demo para la comisión evaluadora.</w:t>
             </w:r>
           </w:p>
         </w:tc>
         <w:tc>
           <w:tcPr>
-            <w:tcW w:w="1440" w:type="dxa"/>
+            <w:tcW w:w="1448" w:type="dxa"/>
+            <w:tcBorders>
+              <w:top w:val="single" w:sz="4" w:space="0" w:color="156082"/>
+              <w:left w:val="nil"/>
+              <w:bottom w:val="single" w:sz="4" w:space="0" w:color="156082"/>
+              <w:right w:val="nil"/>
+            </w:tcBorders>
+            <w:vAlign w:val="center"/>
+            <w:hideMark/>
           </w:tcPr>
           <w:p>
-            <w:r>
-              <w:t>Raúl</w:t>
+            <w:pPr>
+              <w:spacing w:after="0" w:line="240" w:lineRule="auto"/>
+              <w:rPr>
+                <w:rFonts w:ascii="Aptos Narrow" w:eastAsia="Times New Roman" w:hAnsi="Aptos Narrow" w:cs="Times New Roman"/>
+                <w:color w:val="000000"/>
+                <w:lang w:val="es-CL" w:eastAsia="es-CL"/>
+              </w:rPr>
+            </w:pPr>
+            <w:r>
+              <w:rPr>
+                <w:rFonts w:ascii="Aptos Narrow" w:eastAsia="Times New Roman" w:hAnsi="Aptos Narrow" w:cs="Times New Roman"/>
+                <w:color w:val="000000"/>
+                <w:lang w:val="es-CL" w:eastAsia="es-CL"/>
+              </w:rPr>
+              <w:t>Ambos</w:t>
             </w:r>
           </w:p>
         </w:tc>
         <w:tc>
           <w:tcPr>
-            <w:tcW w:w="1440" w:type="dxa"/>
+            <w:tcW w:w="1388" w:type="dxa"/>
+            <w:tcBorders>
+              <w:top w:val="single" w:sz="4" w:space="0" w:color="156082"/>
+              <w:left w:val="nil"/>
+              <w:bottom w:val="single" w:sz="4" w:space="0" w:color="156082"/>
+              <w:right w:val="nil"/>
+            </w:tcBorders>
+            <w:vAlign w:val="center"/>
+            <w:hideMark/>
           </w:tcPr>
           <w:p>
-            <w:r>
-              <w:t>.NET 8, SQL Server, EF Core</w:t>
+            <w:pPr>
+              <w:spacing w:after="0" w:line="240" w:lineRule="auto"/>
+              <w:rPr>
+                <w:rFonts w:ascii="Aptos Narrow" w:eastAsia="Times New Roman" w:hAnsi="Aptos Narrow" w:cs="Times New Roman"/>
+                <w:color w:val="000000"/>
+                <w:lang w:val="es-CL" w:eastAsia="es-CL"/>
+              </w:rPr>
+            </w:pPr>
+            <w:r>
+              <w:rPr>
+                <w:rFonts w:ascii="Aptos Narrow" w:eastAsia="Times New Roman" w:hAnsi="Aptos Narrow" w:cs="Times New Roman"/>
+                <w:color w:val="000000"/>
+                <w:lang w:val="es-CL" w:eastAsia="es-CL"/>
+              </w:rPr>
+              <w:t>Word, PowerPoint, GitHub</w:t>
             </w:r>
           </w:p>
         </w:tc>
         <w:tc>
           <w:tcPr>
-            <w:tcW w:w="1440" w:type="dxa"/>
+            <w:tcW w:w="1527" w:type="dxa"/>
+            <w:tcBorders>
+              <w:top w:val="single" w:sz="4" w:space="0" w:color="156082"/>
+              <w:left w:val="nil"/>
+              <w:bottom w:val="single" w:sz="4" w:space="0" w:color="156082"/>
+              <w:right w:val="nil"/>
+            </w:tcBorders>
+            <w:vAlign w:val="center"/>
+            <w:hideMark/>
           </w:tcPr>
           <w:p>
-            <w:r>
-              <w:t xml:space="preserve">API base + migraciones DB + </w:t>
-            </w:r>
-            <w:proofErr w:type="spellStart"/>
-            <w:r>
-              <w:t>login</w:t>
-            </w:r>
-            <w:proofErr w:type="spellEnd"/>
+            <w:pPr>
+              <w:spacing w:after="0" w:line="240" w:lineRule="auto"/>
+              <w:rPr>
+                <w:rFonts w:ascii="Aptos Narrow" w:eastAsia="Times New Roman" w:hAnsi="Aptos Narrow" w:cs="Times New Roman"/>
+                <w:color w:val="000000"/>
+                <w:lang w:val="es-CL" w:eastAsia="es-CL"/>
+              </w:rPr>
+            </w:pPr>
+            <w:r>
+              <w:rPr>
+                <w:rFonts w:ascii="Aptos Narrow" w:eastAsia="Times New Roman" w:hAnsi="Aptos Narrow" w:cs="Times New Roman"/>
+                <w:color w:val="000000"/>
+                <w:lang w:val="es-CL" w:eastAsia="es-CL"/>
+              </w:rPr>
+              <w:t>Manual técnico y de usuario + presentación final + video demo</w:t>
+            </w:r>
           </w:p>
         </w:tc>
         <w:tc>
           <w:tcPr>
-            <w:tcW w:w="1440" w:type="dxa"/>
+            <w:tcW w:w="1284" w:type="dxa"/>
+            <w:tcBorders>
+              <w:top w:val="single" w:sz="4" w:space="0" w:color="156082"/>
+              <w:left w:val="nil"/>
+              <w:bottom w:val="single" w:sz="4" w:space="0" w:color="156082"/>
+              <w:right w:val="single" w:sz="4" w:space="0" w:color="156082"/>
+            </w:tcBorders>
+            <w:vAlign w:val="center"/>
+            <w:hideMark/>
           </w:tcPr>
           <w:p>
-            <w:r>
-              <w:t>Riesgo: integración JWT; Mitigación: tutorial + pruebas unitarias</w:t>
-            </w:r>
-          </w:p>
-        </w:tc>
-      </w:tr>
-      <w:tr>
-        <w:trPr>
-          <w:jc w:val="center"/>
-        </w:trPr>
-        <w:tc>
-          <w:tcPr>
-            <w:tcW w:w="1440" w:type="dxa"/>
-          </w:tcPr>
-          <w:p>
-            <w:r>
-              <w:t>S4</w:t>
-            </w:r>
-          </w:p>
-        </w:tc>
-        <w:tc>
-          <w:tcPr>
-            <w:tcW w:w="1440" w:type="dxa"/>
-          </w:tcPr>
-          <w:p>
-            <w:r>
-              <w:t xml:space="preserve">Frontend </w:t>
-            </w:r>
-            <w:proofErr w:type="spellStart"/>
-            <w:r>
-              <w:t>React</w:t>
-            </w:r>
-            <w:proofErr w:type="spellEnd"/>
-            <w:r>
-              <w:t xml:space="preserve"> (Vite/TS), </w:t>
-            </w:r>
-            <w:proofErr w:type="spellStart"/>
-            <w:r>
-              <w:t>routing</w:t>
-            </w:r>
-            <w:proofErr w:type="spellEnd"/>
-            <w:r>
-              <w:t xml:space="preserve"> y </w:t>
-            </w:r>
-            <w:proofErr w:type="spellStart"/>
-            <w:r>
-              <w:t>login</w:t>
-            </w:r>
-            <w:proofErr w:type="spellEnd"/>
-            <w:r>
-              <w:t xml:space="preserve"> integrado</w:t>
-            </w:r>
-          </w:p>
-        </w:tc>
-        <w:tc>
-          <w:tcPr>
-            <w:tcW w:w="1440" w:type="dxa"/>
-          </w:tcPr>
-          <w:p>
-            <w:r>
-              <w:t>Matías</w:t>
-            </w:r>
-          </w:p>
-        </w:tc>
-        <w:tc>
-          <w:tcPr>
-            <w:tcW w:w="1440" w:type="dxa"/>
-          </w:tcPr>
-          <w:p>
-            <w:proofErr w:type="spellStart"/>
-            <w:r>
-              <w:t>React</w:t>
-            </w:r>
-            <w:proofErr w:type="spellEnd"/>
-            <w:r>
-              <w:t>, Vite, Axios</w:t>
-            </w:r>
-          </w:p>
-        </w:tc>
-        <w:tc>
-          <w:tcPr>
-            <w:tcW w:w="1440" w:type="dxa"/>
-          </w:tcPr>
-          <w:p>
-            <w:proofErr w:type="spellStart"/>
-            <w:r>
-              <w:t>Login</w:t>
-            </w:r>
-            <w:proofErr w:type="spellEnd"/>
-            <w:r>
-              <w:t xml:space="preserve"> funcionando (E2E básico)</w:t>
-            </w:r>
-          </w:p>
-        </w:tc>
-        <w:tc>
-          <w:tcPr>
-            <w:tcW w:w="1440" w:type="dxa"/>
-          </w:tcPr>
-          <w:p>
-            <w:r>
-              <w:t>Facilitador: experiencia en frontend</w:t>
-            </w:r>
-          </w:p>
-        </w:tc>
-      </w:tr>
-      <w:tr>
-        <w:trPr>
-          <w:jc w:val="center"/>
-        </w:trPr>
-        <w:tc>
-          <w:tcPr>
-            <w:tcW w:w="1440" w:type="dxa"/>
-          </w:tcPr>
-          <w:p>
-            <w:r>
-              <w:t>S5</w:t>
-            </w:r>
-          </w:p>
-        </w:tc>
-        <w:tc>
-          <w:tcPr>
-            <w:tcW w:w="1440" w:type="dxa"/>
-          </w:tcPr>
-          <w:p>
-            <w:r>
-              <w:t xml:space="preserve">Agenda/citas: </w:t>
-            </w:r>
-            <w:proofErr w:type="spellStart"/>
-            <w:r>
-              <w:t>endpoints</w:t>
-            </w:r>
-            <w:proofErr w:type="spellEnd"/>
-            <w:r>
-              <w:t xml:space="preserve"> y UI; Informe de avance</w:t>
-            </w:r>
-          </w:p>
-        </w:tc>
-        <w:tc>
-          <w:tcPr>
-            <w:tcW w:w="1440" w:type="dxa"/>
-          </w:tcPr>
-          <w:p>
-            <w:r>
-              <w:t>Raúl / Matías</w:t>
-            </w:r>
-          </w:p>
-        </w:tc>
-        <w:tc>
-          <w:tcPr>
-            <w:tcW w:w="1440" w:type="dxa"/>
-          </w:tcPr>
-          <w:p>
-            <w:r>
-              <w:t xml:space="preserve">.NET, </w:t>
-            </w:r>
-            <w:proofErr w:type="spellStart"/>
-            <w:r>
-              <w:t>React</w:t>
-            </w:r>
-            <w:proofErr w:type="spellEnd"/>
-            <w:r>
-              <w:t xml:space="preserve">, </w:t>
-            </w:r>
-            <w:proofErr w:type="spellStart"/>
-            <w:r>
-              <w:t>Postman</w:t>
-            </w:r>
-            <w:proofErr w:type="spellEnd"/>
-          </w:p>
-        </w:tc>
-        <w:tc>
-          <w:tcPr>
-            <w:tcW w:w="1440" w:type="dxa"/>
-          </w:tcPr>
-          <w:p>
-            <w:r>
-              <w:t>CRUD agenda/citas + Informe de avance</w:t>
-            </w:r>
-          </w:p>
-        </w:tc>
-        <w:tc>
-          <w:tcPr>
-            <w:tcW w:w="1440" w:type="dxa"/>
-          </w:tcPr>
-          <w:p>
-            <w:r>
-              <w:t>Riesgo: tiempos; Mitigación: reducir alcance de reportes</w:t>
-            </w:r>
-          </w:p>
-        </w:tc>
-      </w:tr>
-      <w:tr>
-        <w:trPr>
-          <w:jc w:val="center"/>
-        </w:trPr>
-        <w:tc>
-          <w:tcPr>
-            <w:tcW w:w="1440" w:type="dxa"/>
-          </w:tcPr>
-          <w:p>
-            <w:r>
-              <w:t>S6</w:t>
-            </w:r>
-          </w:p>
-        </w:tc>
-        <w:tc>
-          <w:tcPr>
-            <w:tcW w:w="1440" w:type="dxa"/>
-          </w:tcPr>
-          <w:p>
-            <w:r>
-              <w:t>Cuestionario de síntomas (modelo y UI)</w:t>
-            </w:r>
-          </w:p>
-        </w:tc>
-        <w:tc>
-          <w:tcPr>
-            <w:tcW w:w="1440" w:type="dxa"/>
-          </w:tcPr>
-          <w:p>
-            <w:r>
-              <w:t>Matías</w:t>
-            </w:r>
-          </w:p>
-        </w:tc>
-        <w:tc>
-          <w:tcPr>
-            <w:tcW w:w="1440" w:type="dxa"/>
-          </w:tcPr>
-          <w:p>
-            <w:proofErr w:type="spellStart"/>
-            <w:r>
-              <w:t>React</w:t>
-            </w:r>
-            <w:proofErr w:type="spellEnd"/>
-            <w:r>
-              <w:t xml:space="preserve">, </w:t>
-            </w:r>
-            <w:proofErr w:type="spellStart"/>
-            <w:r>
-              <w:t>Zustand</w:t>
-            </w:r>
-            <w:proofErr w:type="spellEnd"/>
-            <w:r>
-              <w:t>/</w:t>
-            </w:r>
-            <w:proofErr w:type="spellStart"/>
-            <w:r>
-              <w:t>Context</w:t>
-            </w:r>
-            <w:proofErr w:type="spellEnd"/>
-          </w:p>
-        </w:tc>
-        <w:tc>
-          <w:tcPr>
-            <w:tcW w:w="1440" w:type="dxa"/>
-          </w:tcPr>
-          <w:p>
-            <w:r>
-              <w:t>Formulario dinámico de síntomas</w:t>
-            </w:r>
-          </w:p>
-        </w:tc>
-        <w:tc>
-          <w:tcPr>
-            <w:tcW w:w="1440" w:type="dxa"/>
-          </w:tcPr>
-          <w:p>
-            <w:r>
-              <w:t>Dependencia: catálogo de síntomas</w:t>
-            </w:r>
-          </w:p>
-        </w:tc>
-      </w:tr>
-      <w:tr>
-        <w:trPr>
-          <w:jc w:val="center"/>
-        </w:trPr>
-        <w:tc>
-          <w:tcPr>
-            <w:tcW w:w="1440" w:type="dxa"/>
-          </w:tcPr>
-          <w:p>
-            <w:r>
-              <w:t>S7</w:t>
-            </w:r>
-          </w:p>
-        </w:tc>
-        <w:tc>
-          <w:tcPr>
-            <w:tcW w:w="1440" w:type="dxa"/>
-          </w:tcPr>
-          <w:p>
-            <w:r>
-              <w:t xml:space="preserve">Motor de reglas (banderas rojas) + servicio </w:t>
-            </w:r>
-            <w:proofErr w:type="spellStart"/>
-            <w:r>
-              <w:t>triage</w:t>
-            </w:r>
-            <w:proofErr w:type="spellEnd"/>
-            <w:r>
-              <w:t xml:space="preserve"> básico</w:t>
-            </w:r>
-          </w:p>
-        </w:tc>
-        <w:tc>
-          <w:tcPr>
-            <w:tcW w:w="1440" w:type="dxa"/>
-          </w:tcPr>
-          <w:p>
-            <w:r>
-              <w:t>Raúl</w:t>
-            </w:r>
-          </w:p>
-        </w:tc>
-        <w:tc>
-          <w:tcPr>
-            <w:tcW w:w="1440" w:type="dxa"/>
-          </w:tcPr>
-          <w:p>
-            <w:r>
-              <w:t xml:space="preserve">.NET, Rule </w:t>
-            </w:r>
-            <w:proofErr w:type="spellStart"/>
-            <w:r>
-              <w:t>service</w:t>
-            </w:r>
-            <w:proofErr w:type="spellEnd"/>
-          </w:p>
-        </w:tc>
-        <w:tc>
-          <w:tcPr>
-            <w:tcW w:w="1440" w:type="dxa"/>
-          </w:tcPr>
-          <w:p>
-            <w:r>
-              <w:t xml:space="preserve">API </w:t>
-            </w:r>
-            <w:proofErr w:type="spellStart"/>
-            <w:r>
-              <w:t>triage</w:t>
-            </w:r>
-            <w:proofErr w:type="spellEnd"/>
-            <w:r>
-              <w:t xml:space="preserve"> v1 (especialidad/urgencia)</w:t>
-            </w:r>
-          </w:p>
-        </w:tc>
-        <w:tc>
-          <w:tcPr>
-            <w:tcW w:w="1440" w:type="dxa"/>
-          </w:tcPr>
-          <w:p>
-            <w:r>
-              <w:t>Plan B: reglas solo si IA no está lista</w:t>
-            </w:r>
-          </w:p>
-        </w:tc>
-      </w:tr>
-      <w:tr>
-        <w:trPr>
-          <w:jc w:val="center"/>
-        </w:trPr>
-        <w:tc>
-          <w:tcPr>
-            <w:tcW w:w="1440" w:type="dxa"/>
-          </w:tcPr>
-          <w:p>
-            <w:r>
-              <w:lastRenderedPageBreak/>
-              <w:t>S8</w:t>
-            </w:r>
-          </w:p>
-        </w:tc>
-        <w:tc>
-          <w:tcPr>
-            <w:tcW w:w="1440" w:type="dxa"/>
-          </w:tcPr>
-          <w:p>
-            <w:r>
-              <w:t xml:space="preserve">Panel médico (listado + detalle de </w:t>
-            </w:r>
-            <w:proofErr w:type="spellStart"/>
-            <w:r>
-              <w:t>triage</w:t>
-            </w:r>
-            <w:proofErr w:type="spellEnd"/>
-            <w:r>
-              <w:t>)</w:t>
-            </w:r>
-          </w:p>
-        </w:tc>
-        <w:tc>
-          <w:tcPr>
-            <w:tcW w:w="1440" w:type="dxa"/>
-          </w:tcPr>
-          <w:p>
-            <w:r>
-              <w:t>Matías</w:t>
-            </w:r>
-          </w:p>
-        </w:tc>
-        <w:tc>
-          <w:tcPr>
-            <w:tcW w:w="1440" w:type="dxa"/>
-          </w:tcPr>
-          <w:p>
-            <w:proofErr w:type="spellStart"/>
-            <w:r>
-              <w:t>React</w:t>
-            </w:r>
-            <w:proofErr w:type="spellEnd"/>
-            <w:r>
-              <w:t xml:space="preserve">, Table </w:t>
-            </w:r>
-            <w:proofErr w:type="spellStart"/>
-            <w:r>
-              <w:t>libs</w:t>
-            </w:r>
-            <w:proofErr w:type="spellEnd"/>
-          </w:p>
-        </w:tc>
-        <w:tc>
-          <w:tcPr>
-            <w:tcW w:w="1440" w:type="dxa"/>
-          </w:tcPr>
-          <w:p>
-            <w:r>
-              <w:t>Panel médico básico</w:t>
-            </w:r>
-          </w:p>
-        </w:tc>
-        <w:tc>
-          <w:tcPr>
-            <w:tcW w:w="1440" w:type="dxa"/>
-          </w:tcPr>
-          <w:p>
-            <w:r>
-              <w:t>Riesgo: usabilidad; Mitigación: prototipo rápido</w:t>
-            </w:r>
-          </w:p>
-        </w:tc>
-      </w:tr>
-      <w:tr>
-        <w:trPr>
-          <w:jc w:val="center"/>
-        </w:trPr>
-        <w:tc>
-          <w:tcPr>
-            <w:tcW w:w="1440" w:type="dxa"/>
-          </w:tcPr>
-          <w:p>
-            <w:r>
-              <w:t>S9</w:t>
-            </w:r>
-          </w:p>
-        </w:tc>
-        <w:tc>
-          <w:tcPr>
-            <w:tcW w:w="1440" w:type="dxa"/>
-          </w:tcPr>
-          <w:p>
-            <w:r>
-              <w:t xml:space="preserve">Reportes simples (agendas, uso de </w:t>
-            </w:r>
-            <w:proofErr w:type="spellStart"/>
-            <w:r>
-              <w:t>triage</w:t>
-            </w:r>
-            <w:proofErr w:type="spellEnd"/>
-            <w:r>
-              <w:t>)</w:t>
-            </w:r>
-          </w:p>
-        </w:tc>
-        <w:tc>
-          <w:tcPr>
-            <w:tcW w:w="1440" w:type="dxa"/>
-          </w:tcPr>
-          <w:p>
-            <w:r>
-              <w:t>Raúl</w:t>
-            </w:r>
-          </w:p>
-        </w:tc>
-        <w:tc>
-          <w:tcPr>
-            <w:tcW w:w="1440" w:type="dxa"/>
-          </w:tcPr>
-          <w:p>
-            <w:r>
-              <w:t>SQL, .NET</w:t>
-            </w:r>
-          </w:p>
-        </w:tc>
-        <w:tc>
-          <w:tcPr>
-            <w:tcW w:w="1440" w:type="dxa"/>
-          </w:tcPr>
-          <w:p>
-            <w:proofErr w:type="spellStart"/>
-            <w:r>
-              <w:t>Endpoints</w:t>
-            </w:r>
-            <w:proofErr w:type="spellEnd"/>
-            <w:r>
-              <w:t>/consultas de reportes</w:t>
-            </w:r>
-          </w:p>
-        </w:tc>
-        <w:tc>
-          <w:tcPr>
-            <w:tcW w:w="1440" w:type="dxa"/>
-          </w:tcPr>
-          <w:p>
-            <w:r>
-              <w:t>Facilitador: modelo de datos definido</w:t>
-            </w:r>
-          </w:p>
-        </w:tc>
-      </w:tr>
-      <w:tr>
-        <w:trPr>
-          <w:jc w:val="center"/>
-        </w:trPr>
-        <w:tc>
-          <w:tcPr>
-            <w:tcW w:w="1440" w:type="dxa"/>
-          </w:tcPr>
-          <w:p>
-            <w:r>
-              <w:t>S10</w:t>
-            </w:r>
-          </w:p>
-        </w:tc>
-        <w:tc>
-          <w:tcPr>
-            <w:tcW w:w="1440" w:type="dxa"/>
-          </w:tcPr>
-          <w:p>
-            <w:r>
-              <w:t>Seguridad y roles (Paciente/Médico/</w:t>
-            </w:r>
-            <w:proofErr w:type="spellStart"/>
-            <w:r>
-              <w:t>Admin</w:t>
-            </w:r>
-            <w:proofErr w:type="spellEnd"/>
-            <w:r>
-              <w:t>) + manejo de errores</w:t>
-            </w:r>
-          </w:p>
-        </w:tc>
-        <w:tc>
-          <w:tcPr>
-            <w:tcW w:w="1440" w:type="dxa"/>
-          </w:tcPr>
-          <w:p>
-            <w:r>
-              <w:t>Raúl</w:t>
-            </w:r>
-          </w:p>
-        </w:tc>
-        <w:tc>
-          <w:tcPr>
-            <w:tcW w:w="1440" w:type="dxa"/>
-          </w:tcPr>
-          <w:p>
-            <w:r>
-              <w:t xml:space="preserve">JWT, .NET </w:t>
-            </w:r>
-            <w:proofErr w:type="spellStart"/>
-            <w:r>
-              <w:t>filters</w:t>
-            </w:r>
-            <w:proofErr w:type="spellEnd"/>
-          </w:p>
-        </w:tc>
-        <w:tc>
-          <w:tcPr>
-            <w:tcW w:w="1440" w:type="dxa"/>
-          </w:tcPr>
-          <w:p>
-            <w:r>
-              <w:t>Roles y permisos aplicados</w:t>
-            </w:r>
-          </w:p>
-        </w:tc>
-        <w:tc>
-          <w:tcPr>
-            <w:tcW w:w="1440" w:type="dxa"/>
-          </w:tcPr>
-          <w:p>
-            <w:r>
-              <w:t>Riesgo: autorización fina; Mitigación: matriz de permisos</w:t>
-            </w:r>
-          </w:p>
-        </w:tc>
-      </w:tr>
-      <w:tr>
-        <w:trPr>
-          <w:jc w:val="center"/>
-        </w:trPr>
-        <w:tc>
-          <w:tcPr>
-            <w:tcW w:w="1440" w:type="dxa"/>
-          </w:tcPr>
-          <w:p>
-            <w:r>
-              <w:t>S11</w:t>
-            </w:r>
-          </w:p>
-        </w:tc>
-        <w:tc>
-          <w:tcPr>
-            <w:tcW w:w="1440" w:type="dxa"/>
-          </w:tcPr>
-          <w:p>
-            <w:r>
-              <w:t>Plan y ejecución de pruebas (</w:t>
-            </w:r>
-            <w:proofErr w:type="spellStart"/>
-            <w:r>
-              <w:t>Postman</w:t>
-            </w:r>
-            <w:proofErr w:type="spellEnd"/>
-            <w:r>
-              <w:t>/</w:t>
-            </w:r>
-            <w:proofErr w:type="spellStart"/>
-            <w:r>
-              <w:t>pytest</w:t>
-            </w:r>
-            <w:proofErr w:type="spellEnd"/>
-            <w:r>
-              <w:t>) + QA</w:t>
-            </w:r>
-          </w:p>
-        </w:tc>
-        <w:tc>
-          <w:tcPr>
-            <w:tcW w:w="1440" w:type="dxa"/>
-          </w:tcPr>
-          <w:p>
-            <w:r>
-              <w:t>Matías</w:t>
-            </w:r>
-          </w:p>
-        </w:tc>
-        <w:tc>
-          <w:tcPr>
-            <w:tcW w:w="1440" w:type="dxa"/>
-          </w:tcPr>
-          <w:p>
-            <w:proofErr w:type="spellStart"/>
-            <w:r>
-              <w:t>Postman</w:t>
-            </w:r>
-            <w:proofErr w:type="spellEnd"/>
-            <w:r>
-              <w:t xml:space="preserve">, </w:t>
-            </w:r>
-            <w:proofErr w:type="spellStart"/>
-            <w:r>
-              <w:t>Jest</w:t>
-            </w:r>
-            <w:proofErr w:type="spellEnd"/>
-            <w:r>
-              <w:t>/RTL</w:t>
-            </w:r>
-          </w:p>
-        </w:tc>
-        <w:tc>
-          <w:tcPr>
-            <w:tcW w:w="1440" w:type="dxa"/>
-          </w:tcPr>
-          <w:p>
-            <w:r>
-              <w:t>Plan de pruebas + reporte QA</w:t>
-            </w:r>
-          </w:p>
-        </w:tc>
-        <w:tc>
-          <w:tcPr>
-            <w:tcW w:w="1440" w:type="dxa"/>
-          </w:tcPr>
-          <w:p>
-            <w:r>
-              <w:t>Riesgo: cobertura; Mitigación: priorizar E2E críticos</w:t>
-            </w:r>
-          </w:p>
-        </w:tc>
-      </w:tr>
-      <w:tr>
-        <w:trPr>
-          <w:jc w:val="center"/>
-        </w:trPr>
-        <w:tc>
-          <w:tcPr>
-            <w:tcW w:w="1440" w:type="dxa"/>
-          </w:tcPr>
-          <w:p>
-            <w:r>
-              <w:t>S12</w:t>
-            </w:r>
-          </w:p>
-        </w:tc>
-        <w:tc>
-          <w:tcPr>
-            <w:tcW w:w="1440" w:type="dxa"/>
-          </w:tcPr>
-          <w:p>
-            <w:r>
-              <w:t>Documentación técnica y de usuario (borrador)</w:t>
-            </w:r>
-          </w:p>
-        </w:tc>
-        <w:tc>
-          <w:tcPr>
-            <w:tcW w:w="1440" w:type="dxa"/>
-          </w:tcPr>
-          <w:p>
-            <w:r>
-              <w:t>Raúl / Matías</w:t>
-            </w:r>
-          </w:p>
-        </w:tc>
-        <w:tc>
-          <w:tcPr>
-            <w:tcW w:w="1440" w:type="dxa"/>
-          </w:tcPr>
-          <w:p>
-            <w:proofErr w:type="spellStart"/>
-            <w:r>
-              <w:t>Markdown</w:t>
-            </w:r>
-            <w:proofErr w:type="spellEnd"/>
-            <w:r>
-              <w:t>/Word</w:t>
-            </w:r>
-          </w:p>
-        </w:tc>
-        <w:tc>
-          <w:tcPr>
-            <w:tcW w:w="1440" w:type="dxa"/>
-          </w:tcPr>
-          <w:p>
-            <w:r>
-              <w:t>Manual técnico + Manual usuario (borrador)</w:t>
-            </w:r>
-          </w:p>
-        </w:tc>
-        <w:tc>
-          <w:tcPr>
-            <w:tcW w:w="1440" w:type="dxa"/>
-          </w:tcPr>
-          <w:p>
-            <w:r>
-              <w:t>Dependencia: funcionalidades estables</w:t>
-            </w:r>
-          </w:p>
-        </w:tc>
-      </w:tr>
-      <w:tr>
-        <w:trPr>
-          <w:jc w:val="center"/>
-        </w:trPr>
-        <w:tc>
-          <w:tcPr>
-            <w:tcW w:w="1440" w:type="dxa"/>
-          </w:tcPr>
-          <w:p>
-            <w:r>
-              <w:t>S13</w:t>
-            </w:r>
-          </w:p>
-        </w:tc>
-        <w:tc>
-          <w:tcPr>
-            <w:tcW w:w="1440" w:type="dxa"/>
-          </w:tcPr>
-          <w:p>
-            <w:r>
-              <w:t>Empaquetado y despliegue local/QA; guías de ejecución</w:t>
-            </w:r>
-          </w:p>
-        </w:tc>
-        <w:tc>
-          <w:tcPr>
-            <w:tcW w:w="1440" w:type="dxa"/>
-          </w:tcPr>
-          <w:p>
-            <w:r>
-              <w:t>Raúl</w:t>
-            </w:r>
-          </w:p>
-        </w:tc>
-        <w:tc>
-          <w:tcPr>
-            <w:tcW w:w="1440" w:type="dxa"/>
-          </w:tcPr>
-          <w:p>
-            <w:r>
-              <w:t xml:space="preserve">.NET </w:t>
-            </w:r>
-            <w:proofErr w:type="spellStart"/>
-            <w:r>
-              <w:t>publish</w:t>
-            </w:r>
-            <w:proofErr w:type="spellEnd"/>
-            <w:r>
-              <w:t xml:space="preserve">, </w:t>
-            </w:r>
-            <w:proofErr w:type="spellStart"/>
-            <w:r>
-              <w:t>React</w:t>
-            </w:r>
-            <w:proofErr w:type="spellEnd"/>
-            <w:r>
-              <w:t xml:space="preserve"> </w:t>
-            </w:r>
-            <w:proofErr w:type="spellStart"/>
-            <w:r>
-              <w:t>build</w:t>
-            </w:r>
-            <w:proofErr w:type="spellEnd"/>
-          </w:p>
-        </w:tc>
-        <w:tc>
-          <w:tcPr>
-            <w:tcW w:w="1440" w:type="dxa"/>
-          </w:tcPr>
-          <w:p>
-            <w:proofErr w:type="spellStart"/>
-            <w:r>
-              <w:t>Build</w:t>
-            </w:r>
-            <w:proofErr w:type="spellEnd"/>
-            <w:r>
-              <w:t xml:space="preserve"> reproducible + guía de ejecución</w:t>
-            </w:r>
-          </w:p>
-        </w:tc>
-        <w:tc>
-          <w:tcPr>
-            <w:tcW w:w="1440" w:type="dxa"/>
-          </w:tcPr>
-          <w:p>
-            <w:r>
-              <w:t>Mitigación: demo local si no hay hosting</w:t>
-            </w:r>
-          </w:p>
-        </w:tc>
-      </w:tr>
-      <w:tr>
-        <w:trPr>
-          <w:jc w:val="center"/>
-        </w:trPr>
-        <w:tc>
-          <w:tcPr>
-            <w:tcW w:w="1440" w:type="dxa"/>
-          </w:tcPr>
-          <w:p>
-            <w:r>
-              <w:t>S14</w:t>
-            </w:r>
-          </w:p>
-        </w:tc>
-        <w:tc>
-          <w:tcPr>
-            <w:tcW w:w="1440" w:type="dxa"/>
-          </w:tcPr>
-          <w:p>
-            <w:r>
-              <w:t>Revisión integral + mejoras (ajustes de UX/bugs)</w:t>
-            </w:r>
-          </w:p>
-        </w:tc>
-        <w:tc>
-          <w:tcPr>
-            <w:tcW w:w="1440" w:type="dxa"/>
-          </w:tcPr>
-          <w:p>
-            <w:r>
-              <w:t>Raúl / Matías</w:t>
-            </w:r>
-          </w:p>
-        </w:tc>
-        <w:tc>
-          <w:tcPr>
-            <w:tcW w:w="1440" w:type="dxa"/>
-          </w:tcPr>
-          <w:p>
-            <w:r>
-              <w:t>Herramientas del proyecto</w:t>
-            </w:r>
-          </w:p>
-        </w:tc>
-        <w:tc>
-          <w:tcPr>
-            <w:tcW w:w="1440" w:type="dxa"/>
-          </w:tcPr>
-          <w:p>
-            <w:r>
-              <w:t>Correcciones finales</w:t>
-            </w:r>
-          </w:p>
-        </w:tc>
-        <w:tc>
-          <w:tcPr>
-            <w:tcW w:w="1440" w:type="dxa"/>
-          </w:tcPr>
-          <w:p>
-            <w:r>
-              <w:t>Riesgo: tiempo; Mitigación: foco en bugs críticos</w:t>
-            </w:r>
-          </w:p>
-        </w:tc>
-      </w:tr>
-      <w:tr>
-        <w:trPr>
-          <w:jc w:val="center"/>
-        </w:trPr>
-        <w:tc>
-          <w:tcPr>
-            <w:tcW w:w="1440" w:type="dxa"/>
-          </w:tcPr>
-          <w:p>
-            <w:r>
-              <w:t>S15</w:t>
-            </w:r>
-          </w:p>
-        </w:tc>
-        <w:tc>
-          <w:tcPr>
-            <w:tcW w:w="1440" w:type="dxa"/>
-          </w:tcPr>
-          <w:p>
-            <w:r>
-              <w:t xml:space="preserve">Demo final y cierre (presentación y </w:t>
-            </w:r>
-            <w:r>
-              <w:lastRenderedPageBreak/>
-              <w:t>evidencias)</w:t>
-            </w:r>
-          </w:p>
-        </w:tc>
-        <w:tc>
-          <w:tcPr>
-            <w:tcW w:w="1440" w:type="dxa"/>
-          </w:tcPr>
-          <w:p>
-            <w:r>
-              <w:lastRenderedPageBreak/>
-              <w:t>Raúl / Matías</w:t>
-            </w:r>
-          </w:p>
-        </w:tc>
-        <w:tc>
-          <w:tcPr>
-            <w:tcW w:w="1440" w:type="dxa"/>
-          </w:tcPr>
-          <w:p>
-            <w:r>
-              <w:t>PowerPoint/</w:t>
-            </w:r>
-            <w:proofErr w:type="spellStart"/>
-            <w:r>
-              <w:t>Canva</w:t>
-            </w:r>
-            <w:proofErr w:type="spellEnd"/>
-            <w:r>
-              <w:t>, OBS</w:t>
-            </w:r>
-          </w:p>
-        </w:tc>
-        <w:tc>
-          <w:tcPr>
-            <w:tcW w:w="1440" w:type="dxa"/>
-          </w:tcPr>
-          <w:p>
-            <w:r>
-              <w:t xml:space="preserve">Video demo + presentación + </w:t>
-            </w:r>
-            <w:r>
-              <w:lastRenderedPageBreak/>
-              <w:t>paquete de evidencias</w:t>
-            </w:r>
-          </w:p>
-        </w:tc>
-        <w:tc>
-          <w:tcPr>
-            <w:tcW w:w="1440" w:type="dxa"/>
-          </w:tcPr>
-          <w:p>
-            <w:proofErr w:type="spellStart"/>
-            <w:r>
-              <w:lastRenderedPageBreak/>
-              <w:t>Checklist</w:t>
-            </w:r>
-            <w:proofErr w:type="spellEnd"/>
-            <w:r>
-              <w:t xml:space="preserve"> final en </w:t>
-            </w:r>
-            <w:r>
-              <w:lastRenderedPageBreak/>
-              <w:t>repo</w:t>
+            <w:pPr>
+              <w:spacing w:after="0" w:line="240" w:lineRule="auto"/>
+              <w:rPr>
+                <w:rFonts w:ascii="Aptos Narrow" w:eastAsia="Times New Roman" w:hAnsi="Aptos Narrow" w:cs="Times New Roman"/>
+                <w:color w:val="000000"/>
+                <w:lang w:val="es-CL" w:eastAsia="es-CL"/>
+              </w:rPr>
+            </w:pPr>
+            <w:r>
+              <w:rPr>
+                <w:rFonts w:ascii="Aptos Narrow" w:eastAsia="Times New Roman" w:hAnsi="Aptos Narrow" w:cs="Times New Roman"/>
+                <w:color w:val="000000"/>
+                <w:lang w:val="es-CL" w:eastAsia="es-CL"/>
+              </w:rPr>
+              <w:t>Semanas 13–15</w:t>
             </w:r>
           </w:p>
         </w:tc>
       </w:tr>
     </w:tbl>
+    <w:p>
+      <w:r>
+        <w:br w:type="page"/>
+      </w:r>
+    </w:p>
+    <w:p/>
     <w:p/>
     <w:p>
       <w:pPr>
@@ -3006,9 +3367,9 @@
         <w:tblLook w:val="04A0" w:firstRow="1" w:lastRow="0" w:firstColumn="1" w:lastColumn="0" w:noHBand="0" w:noVBand="1"/>
       </w:tblPr>
       <w:tblGrid>
-        <w:gridCol w:w="2106"/>
-        <w:gridCol w:w="2109"/>
-        <w:gridCol w:w="2142"/>
+        <w:gridCol w:w="2160"/>
+        <w:gridCol w:w="2160"/>
+        <w:gridCol w:w="2160"/>
         <w:gridCol w:w="2499"/>
       </w:tblGrid>
       <w:tr>
@@ -3086,7 +3447,23 @@
           </w:tcPr>
           <w:p>
             <w:r>
-              <w:t xml:space="preserve">Código backend/frontend, </w:t>
+              <w:t xml:space="preserve">Código </w:t>
+            </w:r>
+            <w:proofErr w:type="spellStart"/>
+            <w:r>
+              <w:t>backend</w:t>
+            </w:r>
+            <w:proofErr w:type="spellEnd"/>
+            <w:r>
+              <w:t>/</w:t>
+            </w:r>
+            <w:proofErr w:type="spellStart"/>
+            <w:r>
+              <w:t>frontend</w:t>
+            </w:r>
+            <w:proofErr w:type="spellEnd"/>
+            <w:r>
+              <w:t xml:space="preserve">, </w:t>
             </w:r>
             <w:proofErr w:type="spellStart"/>
             <w:r>
@@ -3586,7 +3963,6 @@
           </w:tcPr>
           <w:p>
             <w:r>
-              <w:lastRenderedPageBreak/>
               <w:t>1.1 Diseña pruebas de validación (producto/proceso)</w:t>
             </w:r>
           </w:p>
@@ -3625,7 +4001,11 @@
             </w:r>
             <w:proofErr w:type="spellEnd"/>
             <w:r>
-              <w:t xml:space="preserve"> (S11) – Sección 7; Repo Git / </w:t>
+              <w:t xml:space="preserve"> (S11) – Sección 7; Repo Git </w:t>
+            </w:r>
+            <w:r>
+              <w:lastRenderedPageBreak/>
+              <w:t xml:space="preserve">/ </w:t>
             </w:r>
             <w:proofErr w:type="spellStart"/>
             <w:r>
@@ -3645,6 +4025,7 @@
           </w:tcPr>
           <w:p>
             <w:r>
+              <w:lastRenderedPageBreak/>
               <w:t>1.2 Aplica pruebas de validación</w:t>
             </w:r>
           </w:p>
@@ -4063,7 +4444,6 @@
       </w:pPr>
       <w:bookmarkStart w:id="15" w:name="_Toc207054922"/>
       <w:r>
-        <w:lastRenderedPageBreak/>
         <w:t>Referencias</w:t>
       </w:r>
       <w:bookmarkEnd w:id="15"/>
@@ -4079,6 +4459,7 @@
       </w:pPr>
       <w:bookmarkStart w:id="16" w:name="_Toc207054923"/>
       <w:r>
+        <w:lastRenderedPageBreak/>
         <w:t>Anexos</w:t>
       </w:r>
       <w:bookmarkEnd w:id="16"/>
@@ -4113,7 +4494,7 @@
     </w:p>
     <w:sectPr>
       <w:pgSz w:w="12240" w:h="15840"/>
-      <w:pgMar w:top="1440" w:right="1800" w:bottom="1440" w:left="1800" w:header="720" w:footer="720" w:gutter="0"/>
+      <w:pgMar w:top="1417" w:right="1701" w:bottom="1417" w:left="1701" w:header="720" w:footer="720" w:gutter="0"/>
       <w:cols w:space="720"/>
       <w:docGrid w:linePitch="360"/>
     </w:sectPr>
@@ -4294,6 +4675,123 @@
       </w:rPr>
     </w:lvl>
   </w:abstractNum>
+  <w:abstractNum w:abstractNumId="9" w15:restartNumberingAfterBreak="0">
+    <w:nsid w:val="05DB5218"/>
+    <w:multiLevelType w:val="multilevel"/>
+    <w:tmpl w:val="61FEB834"/>
+    <w:lvl w:ilvl="0">
+      <w:start w:val="1"/>
+      <w:numFmt w:val="decimal"/>
+      <w:lvlText w:val="%1."/>
+      <w:lvlJc w:val="left"/>
+      <w:pPr>
+        <w:tabs>
+          <w:tab w:val="num" w:pos="720"/>
+        </w:tabs>
+        <w:ind w:left="720" w:hanging="360"/>
+      </w:pPr>
+    </w:lvl>
+    <w:lvl w:ilvl="1">
+      <w:start w:val="1"/>
+      <w:numFmt w:val="bullet"/>
+      <w:lvlText w:val="o"/>
+      <w:lvlJc w:val="left"/>
+      <w:pPr>
+        <w:tabs>
+          <w:tab w:val="num" w:pos="1440"/>
+        </w:tabs>
+        <w:ind w:left="1440" w:hanging="360"/>
+      </w:pPr>
+      <w:rPr>
+        <w:rFonts w:ascii="Courier New" w:hAnsi="Courier New" w:hint="default"/>
+        <w:sz w:val="20"/>
+      </w:rPr>
+    </w:lvl>
+    <w:lvl w:ilvl="2" w:tentative="1">
+      <w:start w:val="1"/>
+      <w:numFmt w:val="decimal"/>
+      <w:lvlText w:val="%3."/>
+      <w:lvlJc w:val="left"/>
+      <w:pPr>
+        <w:tabs>
+          <w:tab w:val="num" w:pos="2160"/>
+        </w:tabs>
+        <w:ind w:left="2160" w:hanging="360"/>
+      </w:pPr>
+    </w:lvl>
+    <w:lvl w:ilvl="3" w:tentative="1">
+      <w:start w:val="1"/>
+      <w:numFmt w:val="decimal"/>
+      <w:lvlText w:val="%4."/>
+      <w:lvlJc w:val="left"/>
+      <w:pPr>
+        <w:tabs>
+          <w:tab w:val="num" w:pos="2880"/>
+        </w:tabs>
+        <w:ind w:left="2880" w:hanging="360"/>
+      </w:pPr>
+    </w:lvl>
+    <w:lvl w:ilvl="4" w:tentative="1">
+      <w:start w:val="1"/>
+      <w:numFmt w:val="decimal"/>
+      <w:lvlText w:val="%5."/>
+      <w:lvlJc w:val="left"/>
+      <w:pPr>
+        <w:tabs>
+          <w:tab w:val="num" w:pos="3600"/>
+        </w:tabs>
+        <w:ind w:left="3600" w:hanging="360"/>
+      </w:pPr>
+    </w:lvl>
+    <w:lvl w:ilvl="5" w:tentative="1">
+      <w:start w:val="1"/>
+      <w:numFmt w:val="decimal"/>
+      <w:lvlText w:val="%6."/>
+      <w:lvlJc w:val="left"/>
+      <w:pPr>
+        <w:tabs>
+          <w:tab w:val="num" w:pos="4320"/>
+        </w:tabs>
+        <w:ind w:left="4320" w:hanging="360"/>
+      </w:pPr>
+    </w:lvl>
+    <w:lvl w:ilvl="6" w:tentative="1">
+      <w:start w:val="1"/>
+      <w:numFmt w:val="decimal"/>
+      <w:lvlText w:val="%7."/>
+      <w:lvlJc w:val="left"/>
+      <w:pPr>
+        <w:tabs>
+          <w:tab w:val="num" w:pos="5040"/>
+        </w:tabs>
+        <w:ind w:left="5040" w:hanging="360"/>
+      </w:pPr>
+    </w:lvl>
+    <w:lvl w:ilvl="7" w:tentative="1">
+      <w:start w:val="1"/>
+      <w:numFmt w:val="decimal"/>
+      <w:lvlText w:val="%8."/>
+      <w:lvlJc w:val="left"/>
+      <w:pPr>
+        <w:tabs>
+          <w:tab w:val="num" w:pos="5760"/>
+        </w:tabs>
+        <w:ind w:left="5760" w:hanging="360"/>
+      </w:pPr>
+    </w:lvl>
+    <w:lvl w:ilvl="8" w:tentative="1">
+      <w:start w:val="1"/>
+      <w:numFmt w:val="decimal"/>
+      <w:lvlText w:val="%9."/>
+      <w:lvlJc w:val="left"/>
+      <w:pPr>
+        <w:tabs>
+          <w:tab w:val="num" w:pos="6480"/>
+        </w:tabs>
+        <w:ind w:left="6480" w:hanging="360"/>
+      </w:pPr>
+    </w:lvl>
+  </w:abstractNum>
   <w:num w:numId="1" w16cid:durableId="1151408050">
     <w:abstractNumId w:val="8"/>
   </w:num>
@@ -4320,6 +4818,9 @@
   </w:num>
   <w:num w:numId="9" w16cid:durableId="143204639">
     <w:abstractNumId w:val="0"/>
+  </w:num>
+  <w:num w:numId="10" w16cid:durableId="217783478">
+    <w:abstractNumId w:val="9"/>
   </w:num>
 </w:numbering>
 </file>
@@ -4930,7 +5431,6 @@
   <w:style w:type="character" w:default="1" w:styleId="Fuentedeprrafopredeter">
     <w:name w:val="Default Paragraph Font"/>
     <w:uiPriority w:val="1"/>
-    <w:semiHidden/>
     <w:unhideWhenUsed/>
   </w:style>
   <w:style w:type="table" w:default="1" w:styleId="Tablanormal">

</xml_diff>

<commit_message>
actualización carta gant y plan de trabajo por cambio de metodología
</commit_message>
<xml_diff>
--- a/Fase 1/Evidencias Grupales/1.4_Desarrollo_informe_de_definicion_del_proyecto_APT.docx
+++ b/Fase 1/Evidencias Grupales/1.4_Desarrollo_informe_de_definicion_del_proyecto_APT.docx
@@ -2136,7 +2136,7 @@
     </w:p>
     <w:tbl>
       <w:tblPr>
-        <w:tblW w:w="9300" w:type="dxa"/>
+        <w:tblW w:w="8040" w:type="dxa"/>
         <w:tblInd w:w="75" w:type="dxa"/>
         <w:tblCellMar>
           <w:left w:w="70" w:type="dxa"/>
@@ -2145,25 +2145,25 @@
         <w:tblLook w:val="04A0" w:firstRow="1" w:lastRow="0" w:firstColumn="1" w:lastColumn="0" w:noHBand="0" w:noVBand="1"/>
       </w:tblPr>
       <w:tblGrid>
-        <w:gridCol w:w="1240"/>
-        <w:gridCol w:w="2349"/>
+        <w:gridCol w:w="1097"/>
+        <w:gridCol w:w="1700"/>
         <w:gridCol w:w="1558"/>
-        <w:gridCol w:w="1376"/>
-        <w:gridCol w:w="1512"/>
-        <w:gridCol w:w="1265"/>
+        <w:gridCol w:w="1198"/>
+        <w:gridCol w:w="1481"/>
+        <w:gridCol w:w="1006"/>
       </w:tblGrid>
       <w:tr>
         <w:trPr>
-          <w:trHeight w:val="528"/>
+          <w:trHeight w:val="1116"/>
         </w:trPr>
         <w:tc>
           <w:tcPr>
-            <w:tcW w:w="1250" w:type="dxa"/>
+            <w:tcW w:w="987" w:type="dxa"/>
             <w:tcBorders>
-              <w:top w:val="single" w:sz="4" w:space="0" w:color="156082"/>
-              <w:left w:val="single" w:sz="4" w:space="0" w:color="156082"/>
-              <w:bottom w:val="nil"/>
-              <w:right w:val="nil"/>
+              <w:top w:val="single" w:sz="4" w:space="0" w:color="auto"/>
+              <w:left w:val="single" w:sz="4" w:space="0" w:color="auto"/>
+              <w:bottom w:val="single" w:sz="4" w:space="0" w:color="auto"/>
+              <w:right w:val="single" w:sz="4" w:space="0" w:color="auto"/>
             </w:tcBorders>
             <w:shd w:val="clear" w:color="156082" w:fill="156082"/>
             <w:vAlign w:val="center"/>
@@ -2196,12 +2196,12 @@
         </w:tc>
         <w:tc>
           <w:tcPr>
-            <w:tcW w:w="2403" w:type="dxa"/>
+            <w:tcW w:w="1807" w:type="dxa"/>
             <w:tcBorders>
-              <w:top w:val="single" w:sz="4" w:space="0" w:color="156082"/>
-              <w:left w:val="nil"/>
-              <w:bottom w:val="nil"/>
-              <w:right w:val="nil"/>
+              <w:top w:val="single" w:sz="4" w:space="0" w:color="auto"/>
+              <w:left w:val="single" w:sz="4" w:space="0" w:color="auto"/>
+              <w:bottom w:val="single" w:sz="4" w:space="0" w:color="auto"/>
+              <w:right w:val="single" w:sz="4" w:space="0" w:color="auto"/>
             </w:tcBorders>
             <w:shd w:val="clear" w:color="156082" w:fill="156082"/>
             <w:vAlign w:val="center"/>
@@ -2233,12 +2233,12 @@
         </w:tc>
         <w:tc>
           <w:tcPr>
-            <w:tcW w:w="1448" w:type="dxa"/>
+            <w:tcW w:w="1493" w:type="dxa"/>
             <w:tcBorders>
-              <w:top w:val="single" w:sz="4" w:space="0" w:color="156082"/>
-              <w:left w:val="nil"/>
-              <w:bottom w:val="nil"/>
-              <w:right w:val="nil"/>
+              <w:top w:val="single" w:sz="4" w:space="0" w:color="auto"/>
+              <w:left w:val="single" w:sz="4" w:space="0" w:color="auto"/>
+              <w:bottom w:val="single" w:sz="4" w:space="0" w:color="auto"/>
+              <w:right w:val="single" w:sz="4" w:space="0" w:color="auto"/>
             </w:tcBorders>
             <w:shd w:val="clear" w:color="156082" w:fill="156082"/>
             <w:vAlign w:val="center"/>
@@ -2270,12 +2270,12 @@
         </w:tc>
         <w:tc>
           <w:tcPr>
-            <w:tcW w:w="1388" w:type="dxa"/>
+            <w:tcW w:w="1088" w:type="dxa"/>
             <w:tcBorders>
-              <w:top w:val="single" w:sz="4" w:space="0" w:color="156082"/>
-              <w:left w:val="nil"/>
-              <w:bottom w:val="nil"/>
-              <w:right w:val="nil"/>
+              <w:top w:val="single" w:sz="4" w:space="0" w:color="auto"/>
+              <w:left w:val="single" w:sz="4" w:space="0" w:color="auto"/>
+              <w:bottom w:val="single" w:sz="4" w:space="0" w:color="auto"/>
+              <w:right w:val="single" w:sz="4" w:space="0" w:color="auto"/>
             </w:tcBorders>
             <w:shd w:val="clear" w:color="156082" w:fill="156082"/>
             <w:vAlign w:val="center"/>
@@ -2307,12 +2307,12 @@
         </w:tc>
         <w:tc>
           <w:tcPr>
-            <w:tcW w:w="1527" w:type="dxa"/>
+            <w:tcW w:w="1647" w:type="dxa"/>
             <w:tcBorders>
-              <w:top w:val="single" w:sz="4" w:space="0" w:color="156082"/>
-              <w:left w:val="nil"/>
-              <w:bottom w:val="nil"/>
-              <w:right w:val="nil"/>
+              <w:top w:val="single" w:sz="4" w:space="0" w:color="auto"/>
+              <w:left w:val="single" w:sz="4" w:space="0" w:color="auto"/>
+              <w:bottom w:val="single" w:sz="4" w:space="0" w:color="auto"/>
+              <w:right w:val="single" w:sz="4" w:space="0" w:color="auto"/>
             </w:tcBorders>
             <w:shd w:val="clear" w:color="156082" w:fill="156082"/>
             <w:vAlign w:val="center"/>
@@ -2344,12 +2344,12 @@
         </w:tc>
         <w:tc>
           <w:tcPr>
-            <w:tcW w:w="1284" w:type="dxa"/>
+            <w:tcW w:w="1018" w:type="dxa"/>
             <w:tcBorders>
-              <w:top w:val="single" w:sz="4" w:space="0" w:color="156082"/>
-              <w:left w:val="nil"/>
-              <w:bottom w:val="nil"/>
-              <w:right w:val="single" w:sz="4" w:space="0" w:color="156082"/>
+              <w:top w:val="single" w:sz="4" w:space="0" w:color="auto"/>
+              <w:left w:val="single" w:sz="4" w:space="0" w:color="auto"/>
+              <w:bottom w:val="single" w:sz="4" w:space="0" w:color="auto"/>
+              <w:right w:val="single" w:sz="4" w:space="0" w:color="auto"/>
             </w:tcBorders>
             <w:shd w:val="clear" w:color="156082" w:fill="156082"/>
             <w:vAlign w:val="center"/>
@@ -2382,16 +2382,16 @@
       </w:tr>
       <w:tr>
         <w:trPr>
-          <w:trHeight w:val="2016"/>
+          <w:trHeight w:val="4320"/>
         </w:trPr>
         <w:tc>
           <w:tcPr>
-            <w:tcW w:w="1250" w:type="dxa"/>
+            <w:tcW w:w="987" w:type="dxa"/>
             <w:tcBorders>
-              <w:top w:val="single" w:sz="4" w:space="0" w:color="156082"/>
-              <w:left w:val="single" w:sz="4" w:space="0" w:color="156082"/>
-              <w:bottom w:val="nil"/>
-              <w:right w:val="nil"/>
+              <w:top w:val="single" w:sz="4" w:space="0" w:color="auto"/>
+              <w:left w:val="single" w:sz="4" w:space="0" w:color="auto"/>
+              <w:bottom w:val="single" w:sz="4" w:space="0" w:color="auto"/>
+              <w:right w:val="single" w:sz="4" w:space="0" w:color="auto"/>
             </w:tcBorders>
             <w:vAlign w:val="center"/>
             <w:hideMark/>
@@ -2421,12 +2421,12 @@
         </w:tc>
         <w:tc>
           <w:tcPr>
-            <w:tcW w:w="2403" w:type="dxa"/>
+            <w:tcW w:w="1807" w:type="dxa"/>
             <w:tcBorders>
-              <w:top w:val="single" w:sz="4" w:space="0" w:color="156082"/>
-              <w:left w:val="nil"/>
-              <w:bottom w:val="nil"/>
-              <w:right w:val="nil"/>
+              <w:top w:val="single" w:sz="4" w:space="0" w:color="auto"/>
+              <w:left w:val="single" w:sz="4" w:space="0" w:color="auto"/>
+              <w:bottom w:val="single" w:sz="4" w:space="0" w:color="auto"/>
+              <w:right w:val="single" w:sz="4" w:space="0" w:color="auto"/>
             </w:tcBorders>
             <w:vAlign w:val="center"/>
             <w:hideMark/>
@@ -2446,18 +2446,18 @@
                 <w:color w:val="000000"/>
                 <w:lang w:val="es-CL" w:eastAsia="es-CL"/>
               </w:rPr>
-              <w:t>Acta de constitución, definición de objetivos, alcance, requerimientos y análisis de factibilidad. Diseño inicial de arquitectura y modelo de datos.</w:t>
+              <w:t>Acta de constitución, levantamiento de requerimientos, análisis de factibilidad técnica y de recursos, diseño de arquitectura y modelo entidad–relación.</w:t>
             </w:r>
           </w:p>
         </w:tc>
         <w:tc>
           <w:tcPr>
-            <w:tcW w:w="1448" w:type="dxa"/>
+            <w:tcW w:w="1493" w:type="dxa"/>
             <w:tcBorders>
-              <w:top w:val="single" w:sz="4" w:space="0" w:color="156082"/>
-              <w:left w:val="nil"/>
-              <w:bottom w:val="nil"/>
-              <w:right w:val="nil"/>
+              <w:top w:val="single" w:sz="4" w:space="0" w:color="auto"/>
+              <w:left w:val="single" w:sz="4" w:space="0" w:color="auto"/>
+              <w:bottom w:val="single" w:sz="4" w:space="0" w:color="auto"/>
+              <w:right w:val="single" w:sz="4" w:space="0" w:color="auto"/>
             </w:tcBorders>
             <w:vAlign w:val="center"/>
             <w:hideMark/>
@@ -2483,12 +2483,12 @@
         </w:tc>
         <w:tc>
           <w:tcPr>
-            <w:tcW w:w="1388" w:type="dxa"/>
+            <w:tcW w:w="1088" w:type="dxa"/>
             <w:tcBorders>
-              <w:top w:val="single" w:sz="4" w:space="0" w:color="156082"/>
-              <w:left w:val="nil"/>
-              <w:bottom w:val="nil"/>
-              <w:right w:val="nil"/>
+              <w:top w:val="single" w:sz="4" w:space="0" w:color="auto"/>
+              <w:left w:val="single" w:sz="4" w:space="0" w:color="auto"/>
+              <w:bottom w:val="single" w:sz="4" w:space="0" w:color="auto"/>
+              <w:right w:val="single" w:sz="4" w:space="0" w:color="auto"/>
             </w:tcBorders>
             <w:vAlign w:val="center"/>
             <w:hideMark/>
@@ -2514,12 +2514,12 @@
         </w:tc>
         <w:tc>
           <w:tcPr>
-            <w:tcW w:w="1527" w:type="dxa"/>
+            <w:tcW w:w="1647" w:type="dxa"/>
             <w:tcBorders>
-              <w:top w:val="single" w:sz="4" w:space="0" w:color="156082"/>
-              <w:left w:val="nil"/>
-              <w:bottom w:val="nil"/>
-              <w:right w:val="nil"/>
+              <w:top w:val="single" w:sz="4" w:space="0" w:color="auto"/>
+              <w:left w:val="single" w:sz="4" w:space="0" w:color="auto"/>
+              <w:bottom w:val="single" w:sz="4" w:space="0" w:color="auto"/>
+              <w:right w:val="single" w:sz="4" w:space="0" w:color="auto"/>
             </w:tcBorders>
             <w:vAlign w:val="center"/>
             <w:hideMark/>
@@ -2539,18 +2539,18 @@
                 <w:color w:val="000000"/>
                 <w:lang w:val="es-CL" w:eastAsia="es-CL"/>
               </w:rPr>
-              <w:t>Documento de definición del proyecto + ERD inicial + arquitectura</w:t>
+              <w:t>Documento de definición del proyecto + ERD inicial + esquema de arquitectura</w:t>
             </w:r>
           </w:p>
         </w:tc>
         <w:tc>
           <w:tcPr>
-            <w:tcW w:w="1284" w:type="dxa"/>
+            <w:tcW w:w="1018" w:type="dxa"/>
             <w:tcBorders>
-              <w:top w:val="single" w:sz="4" w:space="0" w:color="156082"/>
-              <w:left w:val="nil"/>
-              <w:bottom w:val="nil"/>
-              <w:right w:val="single" w:sz="4" w:space="0" w:color="156082"/>
+              <w:top w:val="single" w:sz="4" w:space="0" w:color="auto"/>
+              <w:left w:val="single" w:sz="4" w:space="0" w:color="auto"/>
+              <w:bottom w:val="single" w:sz="4" w:space="0" w:color="auto"/>
+              <w:right w:val="single" w:sz="4" w:space="0" w:color="auto"/>
             </w:tcBorders>
             <w:vAlign w:val="center"/>
             <w:hideMark/>
@@ -2577,16 +2577,16 @@
       </w:tr>
       <w:tr>
         <w:trPr>
-          <w:trHeight w:val="1440"/>
+          <w:trHeight w:val="4608"/>
         </w:trPr>
         <w:tc>
           <w:tcPr>
-            <w:tcW w:w="1250" w:type="dxa"/>
+            <w:tcW w:w="987" w:type="dxa"/>
             <w:tcBorders>
-              <w:top w:val="single" w:sz="4" w:space="0" w:color="156082"/>
-              <w:left w:val="single" w:sz="4" w:space="0" w:color="156082"/>
-              <w:bottom w:val="nil"/>
-              <w:right w:val="nil"/>
+              <w:top w:val="single" w:sz="4" w:space="0" w:color="auto"/>
+              <w:left w:val="single" w:sz="4" w:space="0" w:color="auto"/>
+              <w:bottom w:val="single" w:sz="4" w:space="0" w:color="auto"/>
+              <w:right w:val="single" w:sz="4" w:space="0" w:color="auto"/>
             </w:tcBorders>
             <w:vAlign w:val="center"/>
             <w:hideMark/>
@@ -2616,12 +2616,12 @@
         </w:tc>
         <w:tc>
           <w:tcPr>
-            <w:tcW w:w="2403" w:type="dxa"/>
+            <w:tcW w:w="1807" w:type="dxa"/>
             <w:tcBorders>
-              <w:top w:val="single" w:sz="4" w:space="0" w:color="156082"/>
-              <w:left w:val="nil"/>
-              <w:bottom w:val="nil"/>
-              <w:right w:val="nil"/>
+              <w:top w:val="single" w:sz="4" w:space="0" w:color="auto"/>
+              <w:left w:val="single" w:sz="4" w:space="0" w:color="auto"/>
+              <w:bottom w:val="single" w:sz="4" w:space="0" w:color="auto"/>
+              <w:right w:val="single" w:sz="4" w:space="0" w:color="auto"/>
             </w:tcBorders>
             <w:vAlign w:val="center"/>
             <w:hideMark/>
@@ -2641,7 +2641,7 @@
                 <w:color w:val="000000"/>
                 <w:lang w:val="es-CL" w:eastAsia="es-CL"/>
               </w:rPr>
-              <w:t xml:space="preserve">Desarrollo inicial de </w:t>
+              <w:t xml:space="preserve">Implementación inicial del </w:t>
             </w:r>
             <w:proofErr w:type="spellStart"/>
             <w:r>
@@ -2659,7 +2659,7 @@
                 <w:color w:val="000000"/>
                 <w:lang w:val="es-CL" w:eastAsia="es-CL"/>
               </w:rPr>
-              <w:t xml:space="preserve"> (.NET: autenticación, agenda) y </w:t>
+              <w:t xml:space="preserve"> (.NET: autenticación, agenda) y desarrollo de </w:t>
             </w:r>
             <w:proofErr w:type="spellStart"/>
             <w:r>
@@ -2695,18 +2695,54 @@
                 <w:color w:val="000000"/>
                 <w:lang w:val="es-CL" w:eastAsia="es-CL"/>
               </w:rPr>
-              <w:t>, agendamiento).</w:t>
+              <w:t xml:space="preserve"> y agendamiento). Integración básica </w:t>
+            </w:r>
+            <w:proofErr w:type="spellStart"/>
+            <w:r>
+              <w:rPr>
+                <w:rFonts w:ascii="Aptos Narrow" w:eastAsia="Times New Roman" w:hAnsi="Aptos Narrow" w:cs="Times New Roman"/>
+                <w:color w:val="000000"/>
+                <w:lang w:val="es-CL" w:eastAsia="es-CL"/>
+              </w:rPr>
+              <w:t>frontend</w:t>
+            </w:r>
+            <w:proofErr w:type="spellEnd"/>
+            <w:r>
+              <w:rPr>
+                <w:rFonts w:ascii="Aptos Narrow" w:eastAsia="Times New Roman" w:hAnsi="Aptos Narrow" w:cs="Times New Roman"/>
+                <w:color w:val="000000"/>
+                <w:lang w:val="es-CL" w:eastAsia="es-CL"/>
+              </w:rPr>
+              <w:t>–</w:t>
+            </w:r>
+            <w:proofErr w:type="spellStart"/>
+            <w:r>
+              <w:rPr>
+                <w:rFonts w:ascii="Aptos Narrow" w:eastAsia="Times New Roman" w:hAnsi="Aptos Narrow" w:cs="Times New Roman"/>
+                <w:color w:val="000000"/>
+                <w:lang w:val="es-CL" w:eastAsia="es-CL"/>
+              </w:rPr>
+              <w:t>backend</w:t>
+            </w:r>
+            <w:proofErr w:type="spellEnd"/>
+            <w:r>
+              <w:rPr>
+                <w:rFonts w:ascii="Aptos Narrow" w:eastAsia="Times New Roman" w:hAnsi="Aptos Narrow" w:cs="Times New Roman"/>
+                <w:color w:val="000000"/>
+                <w:lang w:val="es-CL" w:eastAsia="es-CL"/>
+              </w:rPr>
+              <w:t>.</w:t>
             </w:r>
           </w:p>
         </w:tc>
         <w:tc>
           <w:tcPr>
-            <w:tcW w:w="1448" w:type="dxa"/>
+            <w:tcW w:w="1493" w:type="dxa"/>
             <w:tcBorders>
-              <w:top w:val="single" w:sz="4" w:space="0" w:color="156082"/>
-              <w:left w:val="nil"/>
-              <w:bottom w:val="nil"/>
-              <w:right w:val="nil"/>
+              <w:top w:val="single" w:sz="4" w:space="0" w:color="auto"/>
+              <w:left w:val="single" w:sz="4" w:space="0" w:color="auto"/>
+              <w:bottom w:val="single" w:sz="4" w:space="0" w:color="auto"/>
+              <w:right w:val="single" w:sz="4" w:space="0" w:color="auto"/>
             </w:tcBorders>
             <w:vAlign w:val="center"/>
             <w:hideMark/>
@@ -2768,12 +2804,12 @@
         </w:tc>
         <w:tc>
           <w:tcPr>
-            <w:tcW w:w="1388" w:type="dxa"/>
+            <w:tcW w:w="1088" w:type="dxa"/>
             <w:tcBorders>
-              <w:top w:val="single" w:sz="4" w:space="0" w:color="156082"/>
-              <w:left w:val="nil"/>
-              <w:bottom w:val="nil"/>
-              <w:right w:val="nil"/>
+              <w:top w:val="single" w:sz="4" w:space="0" w:color="auto"/>
+              <w:left w:val="single" w:sz="4" w:space="0" w:color="auto"/>
+              <w:bottom w:val="single" w:sz="4" w:space="0" w:color="auto"/>
+              <w:right w:val="single" w:sz="4" w:space="0" w:color="auto"/>
             </w:tcBorders>
             <w:vAlign w:val="center"/>
             <w:hideMark/>
@@ -2811,18 +2847,28 @@
                 <w:color w:val="000000"/>
                 <w:lang w:val="es-CL" w:eastAsia="es-CL"/>
               </w:rPr>
-              <w:t>, SQL Server</w:t>
-            </w:r>
+              <w:t xml:space="preserve">, SQL Server, </w:t>
+            </w:r>
+            <w:proofErr w:type="spellStart"/>
+            <w:r>
+              <w:rPr>
+                <w:rFonts w:ascii="Aptos Narrow" w:eastAsia="Times New Roman" w:hAnsi="Aptos Narrow" w:cs="Times New Roman"/>
+                <w:color w:val="000000"/>
+                <w:lang w:val="es-CL" w:eastAsia="es-CL"/>
+              </w:rPr>
+              <w:t>Postman</w:t>
+            </w:r>
+            <w:proofErr w:type="spellEnd"/>
           </w:p>
         </w:tc>
         <w:tc>
           <w:tcPr>
-            <w:tcW w:w="1527" w:type="dxa"/>
+            <w:tcW w:w="1647" w:type="dxa"/>
             <w:tcBorders>
-              <w:top w:val="single" w:sz="4" w:space="0" w:color="156082"/>
-              <w:left w:val="nil"/>
-              <w:bottom w:val="nil"/>
-              <w:right w:val="nil"/>
+              <w:top w:val="single" w:sz="4" w:space="0" w:color="auto"/>
+              <w:left w:val="single" w:sz="4" w:space="0" w:color="auto"/>
+              <w:bottom w:val="single" w:sz="4" w:space="0" w:color="auto"/>
+              <w:right w:val="single" w:sz="4" w:space="0" w:color="auto"/>
             </w:tcBorders>
             <w:vAlign w:val="center"/>
             <w:hideMark/>
@@ -2876,12 +2922,12 @@
         </w:tc>
         <w:tc>
           <w:tcPr>
-            <w:tcW w:w="1284" w:type="dxa"/>
+            <w:tcW w:w="1018" w:type="dxa"/>
             <w:tcBorders>
-              <w:top w:val="single" w:sz="4" w:space="0" w:color="156082"/>
-              <w:left w:val="nil"/>
-              <w:bottom w:val="nil"/>
-              <w:right w:val="single" w:sz="4" w:space="0" w:color="156082"/>
+              <w:top w:val="single" w:sz="4" w:space="0" w:color="auto"/>
+              <w:left w:val="single" w:sz="4" w:space="0" w:color="auto"/>
+              <w:bottom w:val="single" w:sz="4" w:space="0" w:color="auto"/>
+              <w:right w:val="single" w:sz="4" w:space="0" w:color="auto"/>
             </w:tcBorders>
             <w:vAlign w:val="center"/>
             <w:hideMark/>
@@ -2908,16 +2954,16 @@
       </w:tr>
       <w:tr>
         <w:trPr>
-          <w:trHeight w:val="1728"/>
+          <w:trHeight w:val="5472"/>
         </w:trPr>
         <w:tc>
           <w:tcPr>
-            <w:tcW w:w="1250" w:type="dxa"/>
+            <w:tcW w:w="987" w:type="dxa"/>
             <w:tcBorders>
-              <w:top w:val="single" w:sz="4" w:space="0" w:color="156082"/>
-              <w:left w:val="single" w:sz="4" w:space="0" w:color="156082"/>
-              <w:bottom w:val="nil"/>
-              <w:right w:val="nil"/>
+              <w:top w:val="single" w:sz="4" w:space="0" w:color="auto"/>
+              <w:left w:val="single" w:sz="4" w:space="0" w:color="auto"/>
+              <w:bottom w:val="single" w:sz="4" w:space="0" w:color="auto"/>
+              <w:right w:val="single" w:sz="4" w:space="0" w:color="auto"/>
             </w:tcBorders>
             <w:vAlign w:val="center"/>
             <w:hideMark/>
@@ -2941,18 +2987,19 @@
                 <w:color w:val="000000"/>
                 <w:lang w:val="es-CL" w:eastAsia="es-CL"/>
               </w:rPr>
+              <w:lastRenderedPageBreak/>
               <w:t>Fase 3 – Desarrollo Avanzado y Pruebas</w:t>
             </w:r>
           </w:p>
         </w:tc>
         <w:tc>
           <w:tcPr>
-            <w:tcW w:w="2403" w:type="dxa"/>
+            <w:tcW w:w="1807" w:type="dxa"/>
             <w:tcBorders>
-              <w:top w:val="single" w:sz="4" w:space="0" w:color="156082"/>
-              <w:left w:val="nil"/>
-              <w:bottom w:val="nil"/>
-              <w:right w:val="nil"/>
+              <w:top w:val="single" w:sz="4" w:space="0" w:color="auto"/>
+              <w:left w:val="single" w:sz="4" w:space="0" w:color="auto"/>
+              <w:bottom w:val="single" w:sz="4" w:space="0" w:color="auto"/>
+              <w:right w:val="single" w:sz="4" w:space="0" w:color="auto"/>
             </w:tcBorders>
             <w:vAlign w:val="center"/>
             <w:hideMark/>
@@ -2972,18 +3019,36 @@
                 <w:color w:val="000000"/>
                 <w:lang w:val="es-CL" w:eastAsia="es-CL"/>
               </w:rPr>
-              <w:t>Implementación del cuestionario de síntomas, motor de reglas, panel médico y reportes simples. Ejecución de pruebas unitarias e integración.</w:t>
+              <w:t xml:space="preserve">Desarrollo del cuestionario de síntomas y motor de reglas de </w:t>
+            </w:r>
+            <w:proofErr w:type="spellStart"/>
+            <w:r>
+              <w:rPr>
+                <w:rFonts w:ascii="Aptos Narrow" w:eastAsia="Times New Roman" w:hAnsi="Aptos Narrow" w:cs="Times New Roman"/>
+                <w:color w:val="000000"/>
+                <w:lang w:val="es-CL" w:eastAsia="es-CL"/>
+              </w:rPr>
+              <w:t>triage</w:t>
+            </w:r>
+            <w:proofErr w:type="spellEnd"/>
+            <w:r>
+              <w:rPr>
+                <w:rFonts w:ascii="Aptos Narrow" w:eastAsia="Times New Roman" w:hAnsi="Aptos Narrow" w:cs="Times New Roman"/>
+                <w:color w:val="000000"/>
+                <w:lang w:val="es-CL" w:eastAsia="es-CL"/>
+              </w:rPr>
+              <w:t>. Construcción del panel médico y reportes simples. Ejecución de pruebas unitarias, integración E2E y correcciones.</w:t>
             </w:r>
           </w:p>
         </w:tc>
         <w:tc>
           <w:tcPr>
-            <w:tcW w:w="1448" w:type="dxa"/>
+            <w:tcW w:w="1493" w:type="dxa"/>
             <w:tcBorders>
-              <w:top w:val="single" w:sz="4" w:space="0" w:color="156082"/>
-              <w:left w:val="nil"/>
-              <w:bottom w:val="nil"/>
-              <w:right w:val="nil"/>
+              <w:top w:val="single" w:sz="4" w:space="0" w:color="auto"/>
+              <w:left w:val="single" w:sz="4" w:space="0" w:color="auto"/>
+              <w:bottom w:val="single" w:sz="4" w:space="0" w:color="auto"/>
+              <w:right w:val="single" w:sz="4" w:space="0" w:color="auto"/>
             </w:tcBorders>
             <w:vAlign w:val="center"/>
             <w:hideMark/>
@@ -3009,12 +3074,12 @@
         </w:tc>
         <w:tc>
           <w:tcPr>
-            <w:tcW w:w="1388" w:type="dxa"/>
+            <w:tcW w:w="1088" w:type="dxa"/>
             <w:tcBorders>
-              <w:top w:val="single" w:sz="4" w:space="0" w:color="156082"/>
-              <w:left w:val="nil"/>
-              <w:bottom w:val="nil"/>
-              <w:right w:val="nil"/>
+              <w:top w:val="single" w:sz="4" w:space="0" w:color="auto"/>
+              <w:left w:val="single" w:sz="4" w:space="0" w:color="auto"/>
+              <w:bottom w:val="single" w:sz="4" w:space="0" w:color="auto"/>
+              <w:right w:val="single" w:sz="4" w:space="0" w:color="auto"/>
             </w:tcBorders>
             <w:vAlign w:val="center"/>
             <w:hideMark/>
@@ -3064,16 +3129,24 @@
               <w:t>Postman</w:t>
             </w:r>
             <w:proofErr w:type="spellEnd"/>
+            <w:r>
+              <w:rPr>
+                <w:rFonts w:ascii="Aptos Narrow" w:eastAsia="Times New Roman" w:hAnsi="Aptos Narrow" w:cs="Times New Roman"/>
+                <w:color w:val="000000"/>
+                <w:lang w:val="es-CL" w:eastAsia="es-CL"/>
+              </w:rPr>
+              <w:t>, GitHub</w:t>
+            </w:r>
           </w:p>
         </w:tc>
         <w:tc>
           <w:tcPr>
-            <w:tcW w:w="1527" w:type="dxa"/>
+            <w:tcW w:w="1647" w:type="dxa"/>
             <w:tcBorders>
-              <w:top w:val="single" w:sz="4" w:space="0" w:color="156082"/>
-              <w:left w:val="nil"/>
-              <w:bottom w:val="nil"/>
-              <w:right w:val="nil"/>
+              <w:top w:val="single" w:sz="4" w:space="0" w:color="auto"/>
+              <w:left w:val="single" w:sz="4" w:space="0" w:color="auto"/>
+              <w:bottom w:val="single" w:sz="4" w:space="0" w:color="auto"/>
+              <w:right w:val="single" w:sz="4" w:space="0" w:color="auto"/>
             </w:tcBorders>
             <w:vAlign w:val="center"/>
             <w:hideMark/>
@@ -3111,18 +3184,18 @@
                 <w:color w:val="000000"/>
                 <w:lang w:val="es-CL" w:eastAsia="es-CL"/>
               </w:rPr>
-              <w:t>) + reporte de pruebas QA</w:t>
+              <w:t>) + reporte QA con casos y resultados</w:t>
             </w:r>
           </w:p>
         </w:tc>
         <w:tc>
           <w:tcPr>
-            <w:tcW w:w="1284" w:type="dxa"/>
+            <w:tcW w:w="1018" w:type="dxa"/>
             <w:tcBorders>
-              <w:top w:val="single" w:sz="4" w:space="0" w:color="156082"/>
-              <w:left w:val="nil"/>
-              <w:bottom w:val="nil"/>
-              <w:right w:val="single" w:sz="4" w:space="0" w:color="156082"/>
+              <w:top w:val="single" w:sz="4" w:space="0" w:color="auto"/>
+              <w:left w:val="single" w:sz="4" w:space="0" w:color="auto"/>
+              <w:bottom w:val="single" w:sz="4" w:space="0" w:color="auto"/>
+              <w:right w:val="single" w:sz="4" w:space="0" w:color="auto"/>
             </w:tcBorders>
             <w:vAlign w:val="center"/>
             <w:hideMark/>
@@ -3149,16 +3222,16 @@
       </w:tr>
       <w:tr>
         <w:trPr>
-          <w:trHeight w:val="1440"/>
+          <w:trHeight w:val="3456"/>
         </w:trPr>
         <w:tc>
           <w:tcPr>
-            <w:tcW w:w="1250" w:type="dxa"/>
+            <w:tcW w:w="987" w:type="dxa"/>
             <w:tcBorders>
-              <w:top w:val="single" w:sz="4" w:space="0" w:color="156082"/>
-              <w:left w:val="single" w:sz="4" w:space="0" w:color="156082"/>
-              <w:bottom w:val="single" w:sz="4" w:space="0" w:color="156082"/>
-              <w:right w:val="nil"/>
+              <w:top w:val="single" w:sz="4" w:space="0" w:color="auto"/>
+              <w:left w:val="single" w:sz="4" w:space="0" w:color="auto"/>
+              <w:bottom w:val="single" w:sz="4" w:space="0" w:color="auto"/>
+              <w:right w:val="single" w:sz="4" w:space="0" w:color="auto"/>
             </w:tcBorders>
             <w:vAlign w:val="center"/>
             <w:hideMark/>
@@ -3188,12 +3261,12 @@
         </w:tc>
         <w:tc>
           <w:tcPr>
-            <w:tcW w:w="2403" w:type="dxa"/>
+            <w:tcW w:w="1807" w:type="dxa"/>
             <w:tcBorders>
-              <w:top w:val="single" w:sz="4" w:space="0" w:color="156082"/>
-              <w:left w:val="nil"/>
-              <w:bottom w:val="single" w:sz="4" w:space="0" w:color="156082"/>
-              <w:right w:val="nil"/>
+              <w:top w:val="single" w:sz="4" w:space="0" w:color="auto"/>
+              <w:left w:val="single" w:sz="4" w:space="0" w:color="auto"/>
+              <w:bottom w:val="single" w:sz="4" w:space="0" w:color="auto"/>
+              <w:right w:val="single" w:sz="4" w:space="0" w:color="auto"/>
             </w:tcBorders>
             <w:vAlign w:val="center"/>
             <w:hideMark/>
@@ -3213,18 +3286,18 @@
                 <w:color w:val="000000"/>
                 <w:lang w:val="es-CL" w:eastAsia="es-CL"/>
               </w:rPr>
-              <w:t>Documentación técnica y de usuario. Preparación de presentación y demo para la comisión evaluadora.</w:t>
+              <w:t>Elaboración de documentación técnica y manual de usuario. Preparación de presentación y demo final. Defensa ante la comisión.</w:t>
             </w:r>
           </w:p>
         </w:tc>
         <w:tc>
           <w:tcPr>
-            <w:tcW w:w="1448" w:type="dxa"/>
+            <w:tcW w:w="1493" w:type="dxa"/>
             <w:tcBorders>
-              <w:top w:val="single" w:sz="4" w:space="0" w:color="156082"/>
-              <w:left w:val="nil"/>
-              <w:bottom w:val="single" w:sz="4" w:space="0" w:color="156082"/>
-              <w:right w:val="nil"/>
+              <w:top w:val="single" w:sz="4" w:space="0" w:color="auto"/>
+              <w:left w:val="single" w:sz="4" w:space="0" w:color="auto"/>
+              <w:bottom w:val="single" w:sz="4" w:space="0" w:color="auto"/>
+              <w:right w:val="single" w:sz="4" w:space="0" w:color="auto"/>
             </w:tcBorders>
             <w:vAlign w:val="center"/>
             <w:hideMark/>
@@ -3250,12 +3323,12 @@
         </w:tc>
         <w:tc>
           <w:tcPr>
-            <w:tcW w:w="1388" w:type="dxa"/>
+            <w:tcW w:w="1088" w:type="dxa"/>
             <w:tcBorders>
-              <w:top w:val="single" w:sz="4" w:space="0" w:color="156082"/>
-              <w:left w:val="nil"/>
-              <w:bottom w:val="single" w:sz="4" w:space="0" w:color="156082"/>
-              <w:right w:val="nil"/>
+              <w:top w:val="single" w:sz="4" w:space="0" w:color="auto"/>
+              <w:left w:val="single" w:sz="4" w:space="0" w:color="auto"/>
+              <w:bottom w:val="single" w:sz="4" w:space="0" w:color="auto"/>
+              <w:right w:val="single" w:sz="4" w:space="0" w:color="auto"/>
             </w:tcBorders>
             <w:vAlign w:val="center"/>
             <w:hideMark/>
@@ -3275,18 +3348,18 @@
                 <w:color w:val="000000"/>
                 <w:lang w:val="es-CL" w:eastAsia="es-CL"/>
               </w:rPr>
-              <w:t>Word, PowerPoint, GitHub</w:t>
+              <w:t>Word, PowerPoint, GitHub, OBS</w:t>
             </w:r>
           </w:p>
         </w:tc>
         <w:tc>
           <w:tcPr>
-            <w:tcW w:w="1527" w:type="dxa"/>
+            <w:tcW w:w="1647" w:type="dxa"/>
             <w:tcBorders>
-              <w:top w:val="single" w:sz="4" w:space="0" w:color="156082"/>
-              <w:left w:val="nil"/>
-              <w:bottom w:val="single" w:sz="4" w:space="0" w:color="156082"/>
-              <w:right w:val="nil"/>
+              <w:top w:val="single" w:sz="4" w:space="0" w:color="auto"/>
+              <w:left w:val="single" w:sz="4" w:space="0" w:color="auto"/>
+              <w:bottom w:val="single" w:sz="4" w:space="0" w:color="auto"/>
+              <w:right w:val="single" w:sz="4" w:space="0" w:color="auto"/>
             </w:tcBorders>
             <w:vAlign w:val="center"/>
             <w:hideMark/>
@@ -3312,12 +3385,12 @@
         </w:tc>
         <w:tc>
           <w:tcPr>
-            <w:tcW w:w="1284" w:type="dxa"/>
+            <w:tcW w:w="1018" w:type="dxa"/>
             <w:tcBorders>
-              <w:top w:val="single" w:sz="4" w:space="0" w:color="156082"/>
-              <w:left w:val="nil"/>
-              <w:bottom w:val="single" w:sz="4" w:space="0" w:color="156082"/>
-              <w:right w:val="single" w:sz="4" w:space="0" w:color="156082"/>
+              <w:top w:val="single" w:sz="4" w:space="0" w:color="auto"/>
+              <w:left w:val="single" w:sz="4" w:space="0" w:color="auto"/>
+              <w:bottom w:val="single" w:sz="4" w:space="0" w:color="auto"/>
+              <w:right w:val="single" w:sz="4" w:space="0" w:color="auto"/>
             </w:tcBorders>
             <w:vAlign w:val="center"/>
             <w:hideMark/>
@@ -4444,14 +4517,10 @@
       </w:pPr>
       <w:bookmarkStart w:id="15" w:name="_Toc207054922"/>
       <w:r>
+        <w:lastRenderedPageBreak/>
         <w:t>Referencias</w:t>
       </w:r>
       <w:bookmarkEnd w:id="15"/>
-    </w:p>
-    <w:p>
-      <w:r>
-        <w:t>[Si aplica, agrega referencias con el formato de la escuela.]</w:t>
-      </w:r>
     </w:p>
     <w:p>
       <w:pPr>
@@ -4459,7 +4528,6 @@
       </w:pPr>
       <w:bookmarkStart w:id="16" w:name="_Toc207054923"/>
       <w:r>
-        <w:lastRenderedPageBreak/>
         <w:t>Anexos</w:t>
       </w:r>
       <w:bookmarkEnd w:id="16"/>
@@ -5431,6 +5499,7 @@
   <w:style w:type="character" w:default="1" w:styleId="Fuentedeprrafopredeter">
     <w:name w:val="Default Paragraph Font"/>
     <w:uiPriority w:val="1"/>
+    <w:semiHidden/>
     <w:unhideWhenUsed/>
   </w:style>
   <w:style w:type="table" w:default="1" w:styleId="Tablanormal">

</xml_diff>